<commit_message>
feat: show portal session user in header and expand RAG booking docs
Display logged-in patient name with logout on the public landing page, and document Jalali/relative booking plus booking OTP flows in the RAG guide.
</commit_message>
<xml_diff>
--- a/Docs/راهنمای-ساخت-چت‌بات-RAG-Healan.docx
+++ b/Docs/راهنمای-ساخت-چت‌بات-RAG-Healan.docx
@@ -30,7 +30,7 @@
           <w:b/>
           <w:sz w:val="30"/>
         </w:rPr>
-        <w:t>راهنمای کامل RAG با نام جداول، فیلدها، کلاس‌ها و فلو مثال‌دار</w:t>
+        <w:t>راهنمای کامل RAG + رزرو نوبت (تاریخ شمسی/نسبی و OTP)</w:t>
       </w:r>
     </w:p>
     <w:p>
@@ -292,7 +292,39 @@
           <w:b w:val="0"/>
           <w:sz w:val="24"/>
         </w:rPr>
-        <w:t>پیوست — رزرو نوبت (جدا از RAG)</w:t>
+        <w:t>فصل ۱۴ — رزرو نوبت از چت (جدا از RAG)</w:t>
+      </w:r>
+    </w:p>
+    <w:p>
+      <w:pPr>
+        <w:pStyle w:val="ListBullet"/>
+        <w:bidi w:val="1"/>
+        <w:spacing w:after="160" w:line="360" w:lineRule="auto"/>
+        <w:jc w:val="right"/>
+      </w:pPr>
+      <w:r>
+        <w:rPr>
+          <w:rFonts w:ascii="B Nazanin" w:hAnsi="B Nazanin" w:cs="B Nazanin" w:eastAsia="B Nazanin"/>
+          <w:b w:val="0"/>
+          <w:sz w:val="24"/>
+        </w:rPr>
+        <w:t>فصل ۱۵ — احراز هویت رزرو (OTP موبایل)</w:t>
+      </w:r>
+    </w:p>
+    <w:p>
+      <w:pPr>
+        <w:pStyle w:val="ListBullet"/>
+        <w:bidi w:val="1"/>
+        <w:spacing w:after="160" w:line="360" w:lineRule="auto"/>
+        <w:jc w:val="right"/>
+      </w:pPr>
+      <w:r>
+        <w:rPr>
+          <w:rFonts w:ascii="B Nazanin" w:hAnsi="B Nazanin" w:cs="B Nazanin" w:eastAsia="B Nazanin"/>
+          <w:b w:val="0"/>
+          <w:sz w:val="24"/>
+        </w:rPr>
+        <w:t>فصل ۱۶ — ذخیره OTP رزرو و عیب‌یابی</w:t>
       </w:r>
     </w:p>
     <w:p>
@@ -7215,7 +7247,23 @@
           <w:b w:val="0"/>
           <w:sz w:val="24"/>
         </w:rPr>
-        <w:t>OTP: PortalOtpRequest / PortalOtpVerify · توکن portal_rag_access_token</w:t>
+        <w:t>OTP سقف RAG: PortalOtpRequest / PortalOtpVerify · توکن portal_rag_access_token</w:t>
+      </w:r>
+    </w:p>
+    <w:p>
+      <w:pPr>
+        <w:pStyle w:val="ListBullet"/>
+        <w:bidi w:val="1"/>
+        <w:spacing w:after="160" w:line="360" w:lineRule="auto"/>
+        <w:jc w:val="right"/>
+      </w:pPr>
+      <w:r>
+        <w:rPr>
+          <w:rFonts w:ascii="B Nazanin" w:hAnsi="B Nazanin" w:cs="B Nazanin" w:eastAsia="B Nazanin"/>
+          <w:b w:val="0"/>
+          <w:sz w:val="24"/>
+        </w:rPr>
+        <w:t>OTP رزرو نوبت جداست (فصل ۱۵): BookingOtpRequest / BookingOtpVerify · PortalAuthModal</w:t>
       </w:r>
     </w:p>
     <w:p>
@@ -8793,6 +8841,182 @@
                 <w:sz w:val="20"/>
               </w:rPr>
               <w:t>/Healan/api/v1/RagKnowledge/SettingGet|SettingSave</w:t>
+            </w:r>
+          </w:p>
+        </w:tc>
+      </w:tr>
+      <w:tr>
+        <w:tc>
+          <w:tcPr>
+            <w:tcW w:type="dxa" w:w="4986"/>
+          </w:tcPr>
+          <w:p>
+            <w:pPr>
+              <w:bidi w:val="1"/>
+              <w:spacing w:after="160" w:line="360" w:lineRule="auto"/>
+              <w:jc w:val="right"/>
+            </w:pPr>
+            <w:r/>
+            <w:r>
+              <w:rPr>
+                <w:rFonts w:ascii="B Nazanin" w:hAnsi="B Nazanin" w:cs="B Nazanin" w:eastAsia="B Nazanin"/>
+                <w:b w:val="0"/>
+                <w:sz w:val="20"/>
+              </w:rPr>
+              <w:t>POST</w:t>
+            </w:r>
+          </w:p>
+        </w:tc>
+        <w:tc>
+          <w:tcPr>
+            <w:tcW w:type="dxa" w:w="4986"/>
+          </w:tcPr>
+          <w:p>
+            <w:pPr>
+              <w:bidi w:val="1"/>
+              <w:spacing w:after="160" w:line="360" w:lineRule="auto"/>
+              <w:jc w:val="right"/>
+            </w:pPr>
+            <w:r/>
+            <w:r>
+              <w:rPr>
+                <w:rFonts w:ascii="B Nazanin" w:hAnsi="B Nazanin" w:cs="B Nazanin" w:eastAsia="B Nazanin"/>
+                <w:b w:val="0"/>
+                <w:sz w:val="20"/>
+              </w:rPr>
+              <w:t>/Healan/api/v1/PortalPublic/BookingOtpRequest</w:t>
+            </w:r>
+          </w:p>
+        </w:tc>
+      </w:tr>
+      <w:tr>
+        <w:tc>
+          <w:tcPr>
+            <w:tcW w:type="dxa" w:w="4986"/>
+          </w:tcPr>
+          <w:p>
+            <w:pPr>
+              <w:bidi w:val="1"/>
+              <w:spacing w:after="160" w:line="360" w:lineRule="auto"/>
+              <w:jc w:val="right"/>
+            </w:pPr>
+            <w:r/>
+            <w:r>
+              <w:rPr>
+                <w:rFonts w:ascii="B Nazanin" w:hAnsi="B Nazanin" w:cs="B Nazanin" w:eastAsia="B Nazanin"/>
+                <w:b w:val="0"/>
+                <w:sz w:val="20"/>
+              </w:rPr>
+              <w:t>POST</w:t>
+            </w:r>
+          </w:p>
+        </w:tc>
+        <w:tc>
+          <w:tcPr>
+            <w:tcW w:type="dxa" w:w="4986"/>
+          </w:tcPr>
+          <w:p>
+            <w:pPr>
+              <w:bidi w:val="1"/>
+              <w:spacing w:after="160" w:line="360" w:lineRule="auto"/>
+              <w:jc w:val="right"/>
+            </w:pPr>
+            <w:r/>
+            <w:r>
+              <w:rPr>
+                <w:rFonts w:ascii="B Nazanin" w:hAnsi="B Nazanin" w:cs="B Nazanin" w:eastAsia="B Nazanin"/>
+                <w:b w:val="0"/>
+                <w:sz w:val="20"/>
+              </w:rPr>
+              <w:t>/Healan/api/v1/PortalPublic/BookingOtpVerify</w:t>
+            </w:r>
+          </w:p>
+        </w:tc>
+      </w:tr>
+      <w:tr>
+        <w:tc>
+          <w:tcPr>
+            <w:tcW w:type="dxa" w:w="4986"/>
+          </w:tcPr>
+          <w:p>
+            <w:pPr>
+              <w:bidi w:val="1"/>
+              <w:spacing w:after="160" w:line="360" w:lineRule="auto"/>
+              <w:jc w:val="right"/>
+            </w:pPr>
+            <w:r/>
+            <w:r>
+              <w:rPr>
+                <w:rFonts w:ascii="B Nazanin" w:hAnsi="B Nazanin" w:cs="B Nazanin" w:eastAsia="B Nazanin"/>
+                <w:b w:val="0"/>
+                <w:sz w:val="20"/>
+              </w:rPr>
+              <w:t>GET</w:t>
+            </w:r>
+          </w:p>
+        </w:tc>
+        <w:tc>
+          <w:tcPr>
+            <w:tcW w:type="dxa" w:w="4986"/>
+          </w:tcPr>
+          <w:p>
+            <w:pPr>
+              <w:bidi w:val="1"/>
+              <w:spacing w:after="160" w:line="360" w:lineRule="auto"/>
+              <w:jc w:val="right"/>
+            </w:pPr>
+            <w:r/>
+            <w:r>
+              <w:rPr>
+                <w:rFonts w:ascii="B Nazanin" w:hAnsi="B Nazanin" w:cs="B Nazanin" w:eastAsia="B Nazanin"/>
+                <w:b w:val="0"/>
+                <w:sz w:val="20"/>
+              </w:rPr>
+              <w:t>/Healan/api/v1/PortalPublic/BookingOpenSlots</w:t>
+            </w:r>
+          </w:p>
+        </w:tc>
+      </w:tr>
+      <w:tr>
+        <w:tc>
+          <w:tcPr>
+            <w:tcW w:type="dxa" w:w="4986"/>
+          </w:tcPr>
+          <w:p>
+            <w:pPr>
+              <w:bidi w:val="1"/>
+              <w:spacing w:after="160" w:line="360" w:lineRule="auto"/>
+              <w:jc w:val="right"/>
+            </w:pPr>
+            <w:r/>
+            <w:r>
+              <w:rPr>
+                <w:rFonts w:ascii="B Nazanin" w:hAnsi="B Nazanin" w:cs="B Nazanin" w:eastAsia="B Nazanin"/>
+                <w:b w:val="0"/>
+                <w:sz w:val="20"/>
+              </w:rPr>
+              <w:t>POST</w:t>
+            </w:r>
+          </w:p>
+        </w:tc>
+        <w:tc>
+          <w:tcPr>
+            <w:tcW w:type="dxa" w:w="4986"/>
+          </w:tcPr>
+          <w:p>
+            <w:pPr>
+              <w:bidi w:val="1"/>
+              <w:spacing w:after="160" w:line="360" w:lineRule="auto"/>
+              <w:jc w:val="right"/>
+            </w:pPr>
+            <w:r/>
+            <w:r>
+              <w:rPr>
+                <w:rFonts w:ascii="B Nazanin" w:hAnsi="B Nazanin" w:cs="B Nazanin" w:eastAsia="B Nazanin"/>
+                <w:b w:val="0"/>
+                <w:sz w:val="20"/>
+              </w:rPr>
+              <w:t>/Healan/api/v1/PortalPublic/BookingCreate</w:t>
             </w:r>
           </w:p>
         </w:tc>
@@ -9217,7 +9441,7 @@
           <w:color w:val="1F4E79"/>
           <w:sz w:val="36"/>
         </w:rPr>
-        <w:t>پیوست — رزرو نوبت از چت</w:t>
+        <w:t>فصل ۱۴ — رزرو نوبت از چت (جدا از RAG)</w:t>
       </w:r>
     </w:p>
     <w:p>
@@ -9232,9 +9456,2568 @@
           <w:b w:val="0"/>
           <w:sz w:val="24"/>
         </w:rPr>
-        <w:t>اگر پیام درباره نوبت باشد، فرانت بدون RagAsk وارد رزرو می‌شود (bookingIntent.ts، Assistant/index.tsx). با Ingest/Chroma اشتباه گرفته نشود.</w:t>
+        <w:t>اگر پیام درباره نوبت باشد، فرانت بدون RagAsk وارد رزرو می‌شود. با Ingest/Chroma اشتباه گرفته نشود.</w:t>
       </w:r>
     </w:p>
+    <w:p>
+      <w:pPr>
+        <w:bidi w:val="0"/>
+        <w:spacing w:before="80" w:after="200"/>
+        <w:jc w:val="left"/>
+        <w:shd w:fill="F1F5F9" w:val="clear"/>
+      </w:pPr>
+      <w:r>
+        <w:rPr>
+          <w:rFonts w:ascii="Consolas" w:hAnsi="Consolas" w:cs="Consolas" w:eastAsia="Consolas"/>
+          <w:b w:val="0"/>
+          <w:sz w:val="18"/>
+        </w:rPr>
+        <w:t>پیام کاربر</w:t>
+        <w:br/>
+        <w:t xml:space="preserve">  → parseBookingIntent (bookingIntent.ts)</w:t>
+        <w:br/>
+        <w:t xml:space="preserve">  → kind=none → RagAsk</w:t>
+        <w:br/>
+        <w:t xml:space="preserve">  → dateParseError → پیام خطا (بدون لاگین)</w:t>
+        <w:br/>
+        <w:t xml:space="preserve">  → ensureBookingAuth → PortalAuthModal</w:t>
+        <w:br/>
+        <w:t xml:space="preserve">  → BookingOpenSlots / Create / Cancel / Reschedule</w:t>
+      </w:r>
+    </w:p>
+    <w:tbl>
+      <w:tblPr>
+        <w:tblStyle w:val="TableGrid"/>
+        <w:tblW w:type="auto" w:w="0"/>
+        <w:jc w:val="center"/>
+        <w:tblLook w:firstColumn="1" w:firstRow="1" w:lastColumn="0" w:lastRow="0" w:noHBand="0" w:noVBand="1" w:val="04A0"/>
+      </w:tblPr>
+      <w:tblGrid>
+        <w:gridCol w:w="4986"/>
+        <w:gridCol w:w="4986"/>
+      </w:tblGrid>
+      <w:tr>
+        <w:tc>
+          <w:tcPr>
+            <w:tcW w:type="dxa" w:w="4986"/>
+            <w:shd w:fill="DBEAFE" w:val="clear"/>
+          </w:tcPr>
+          <w:p>
+            <w:pPr>
+              <w:bidi w:val="1"/>
+              <w:spacing w:after="160" w:line="360" w:lineRule="auto"/>
+              <w:jc w:val="right"/>
+            </w:pPr>
+            <w:r/>
+            <w:r>
+              <w:rPr>
+                <w:rFonts w:ascii="B Nazanin" w:hAnsi="B Nazanin" w:cs="B Nazanin" w:eastAsia="B Nazanin"/>
+                <w:b/>
+                <w:sz w:val="22"/>
+              </w:rPr>
+              <w:t>فایل</w:t>
+            </w:r>
+          </w:p>
+        </w:tc>
+        <w:tc>
+          <w:tcPr>
+            <w:tcW w:type="dxa" w:w="4986"/>
+            <w:shd w:fill="DBEAFE" w:val="clear"/>
+          </w:tcPr>
+          <w:p>
+            <w:pPr>
+              <w:bidi w:val="1"/>
+              <w:spacing w:after="160" w:line="360" w:lineRule="auto"/>
+              <w:jc w:val="right"/>
+            </w:pPr>
+            <w:r/>
+            <w:r>
+              <w:rPr>
+                <w:rFonts w:ascii="B Nazanin" w:hAnsi="B Nazanin" w:cs="B Nazanin" w:eastAsia="B Nazanin"/>
+                <w:b/>
+                <w:sz w:val="22"/>
+              </w:rPr>
+              <w:t>نقش</w:t>
+            </w:r>
+          </w:p>
+        </w:tc>
+      </w:tr>
+      <w:tr>
+        <w:tc>
+          <w:tcPr>
+            <w:tcW w:type="dxa" w:w="4986"/>
+          </w:tcPr>
+          <w:p>
+            <w:pPr>
+              <w:bidi w:val="1"/>
+              <w:spacing w:after="160" w:line="360" w:lineRule="auto"/>
+              <w:jc w:val="right"/>
+            </w:pPr>
+            <w:r/>
+            <w:r>
+              <w:rPr>
+                <w:rFonts w:ascii="B Nazanin" w:hAnsi="B Nazanin" w:cs="B Nazanin" w:eastAsia="B Nazanin"/>
+                <w:b w:val="0"/>
+                <w:sz w:val="20"/>
+              </w:rPr>
+              <w:t>Assistant/index.tsx</w:t>
+            </w:r>
+          </w:p>
+        </w:tc>
+        <w:tc>
+          <w:tcPr>
+            <w:tcW w:type="dxa" w:w="4986"/>
+          </w:tcPr>
+          <w:p>
+            <w:pPr>
+              <w:bidi w:val="1"/>
+              <w:spacing w:after="160" w:line="360" w:lineRule="auto"/>
+              <w:jc w:val="right"/>
+            </w:pPr>
+            <w:r/>
+            <w:r>
+              <w:rPr>
+                <w:rFonts w:ascii="B Nazanin" w:hAnsi="B Nazanin" w:cs="B Nazanin" w:eastAsia="B Nazanin"/>
+                <w:b w:val="0"/>
+                <w:sz w:val="20"/>
+              </w:rPr>
+              <w:t>ارکستراسیون UI و دکمه‌های اسلات</w:t>
+            </w:r>
+          </w:p>
+        </w:tc>
+      </w:tr>
+      <w:tr>
+        <w:tc>
+          <w:tcPr>
+            <w:tcW w:type="dxa" w:w="4986"/>
+          </w:tcPr>
+          <w:p>
+            <w:pPr>
+              <w:bidi w:val="1"/>
+              <w:spacing w:after="160" w:line="360" w:lineRule="auto"/>
+              <w:jc w:val="right"/>
+            </w:pPr>
+            <w:r/>
+            <w:r>
+              <w:rPr>
+                <w:rFonts w:ascii="B Nazanin" w:hAnsi="B Nazanin" w:cs="B Nazanin" w:eastAsia="B Nazanin"/>
+                <w:b w:val="0"/>
+                <w:sz w:val="20"/>
+              </w:rPr>
+              <w:t>Assistant/bookingIntent.ts</w:t>
+            </w:r>
+          </w:p>
+        </w:tc>
+        <w:tc>
+          <w:tcPr>
+            <w:tcW w:type="dxa" w:w="4986"/>
+          </w:tcPr>
+          <w:p>
+            <w:pPr>
+              <w:bidi w:val="1"/>
+              <w:spacing w:after="160" w:line="360" w:lineRule="auto"/>
+              <w:jc w:val="right"/>
+            </w:pPr>
+            <w:r/>
+            <w:r>
+              <w:rPr>
+                <w:rFonts w:ascii="B Nazanin" w:hAnsi="B Nazanin" w:cs="B Nazanin" w:eastAsia="B Nazanin"/>
+                <w:b w:val="0"/>
+                <w:sz w:val="20"/>
+              </w:rPr>
+              <w:t>تشخیص kind + روز + ساعت (بدون LLM)</w:t>
+            </w:r>
+          </w:p>
+        </w:tc>
+      </w:tr>
+      <w:tr>
+        <w:tc>
+          <w:tcPr>
+            <w:tcW w:type="dxa" w:w="4986"/>
+          </w:tcPr>
+          <w:p>
+            <w:pPr>
+              <w:bidi w:val="1"/>
+              <w:spacing w:after="160" w:line="360" w:lineRule="auto"/>
+              <w:jc w:val="right"/>
+            </w:pPr>
+            <w:r/>
+            <w:r>
+              <w:rPr>
+                <w:rFonts w:ascii="B Nazanin" w:hAnsi="B Nazanin" w:cs="B Nazanin" w:eastAsia="B Nazanin"/>
+                <w:b w:val="0"/>
+                <w:sz w:val="20"/>
+              </w:rPr>
+              <w:t>Assistant/jalaliDate.ts</w:t>
+            </w:r>
+          </w:p>
+        </w:tc>
+        <w:tc>
+          <w:tcPr>
+            <w:tcW w:type="dxa" w:w="4986"/>
+          </w:tcPr>
+          <w:p>
+            <w:pPr>
+              <w:bidi w:val="1"/>
+              <w:spacing w:after="160" w:line="360" w:lineRule="auto"/>
+              <w:jc w:val="right"/>
+            </w:pPr>
+            <w:r/>
+            <w:r>
+              <w:rPr>
+                <w:rFonts w:ascii="B Nazanin" w:hAnsi="B Nazanin" w:cs="B Nazanin" w:eastAsia="B Nazanin"/>
+                <w:b w:val="0"/>
+                <w:sz w:val="20"/>
+              </w:rPr>
+              <w:t>تاریخ شمسی مطلق → dayKey میلادی</w:t>
+            </w:r>
+          </w:p>
+        </w:tc>
+      </w:tr>
+      <w:tr>
+        <w:tc>
+          <w:tcPr>
+            <w:tcW w:type="dxa" w:w="4986"/>
+          </w:tcPr>
+          <w:p>
+            <w:pPr>
+              <w:bidi w:val="1"/>
+              <w:spacing w:after="160" w:line="360" w:lineRule="auto"/>
+              <w:jc w:val="right"/>
+            </w:pPr>
+            <w:r/>
+            <w:r>
+              <w:rPr>
+                <w:rFonts w:ascii="B Nazanin" w:hAnsi="B Nazanin" w:cs="B Nazanin" w:eastAsia="B Nazanin"/>
+                <w:b w:val="0"/>
+                <w:sz w:val="20"/>
+              </w:rPr>
+              <w:t>PortalAuthModal.tsx</w:t>
+            </w:r>
+          </w:p>
+        </w:tc>
+        <w:tc>
+          <w:tcPr>
+            <w:tcW w:type="dxa" w:w="4986"/>
+          </w:tcPr>
+          <w:p>
+            <w:pPr>
+              <w:bidi w:val="1"/>
+              <w:spacing w:after="160" w:line="360" w:lineRule="auto"/>
+              <w:jc w:val="right"/>
+            </w:pPr>
+            <w:r/>
+            <w:r>
+              <w:rPr>
+                <w:rFonts w:ascii="B Nazanin" w:hAnsi="B Nazanin" w:cs="B Nazanin" w:eastAsia="B Nazanin"/>
+                <w:b w:val="0"/>
+                <w:sz w:val="20"/>
+              </w:rPr>
+              <w:t>OTP موبایل رزرو</w:t>
+            </w:r>
+          </w:p>
+        </w:tc>
+      </w:tr>
+      <w:tr>
+        <w:tc>
+          <w:tcPr>
+            <w:tcW w:type="dxa" w:w="4986"/>
+          </w:tcPr>
+          <w:p>
+            <w:pPr>
+              <w:bidi w:val="1"/>
+              <w:spacing w:after="160" w:line="360" w:lineRule="auto"/>
+              <w:jc w:val="right"/>
+            </w:pPr>
+            <w:r/>
+            <w:r>
+              <w:rPr>
+                <w:rFonts w:ascii="B Nazanin" w:hAnsi="B Nazanin" w:cs="B Nazanin" w:eastAsia="B Nazanin"/>
+                <w:b w:val="0"/>
+                <w:sz w:val="20"/>
+              </w:rPr>
+              <w:t>portalApi.ts</w:t>
+            </w:r>
+          </w:p>
+        </w:tc>
+        <w:tc>
+          <w:tcPr>
+            <w:tcW w:type="dxa" w:w="4986"/>
+          </w:tcPr>
+          <w:p>
+            <w:pPr>
+              <w:bidi w:val="1"/>
+              <w:spacing w:after="160" w:line="360" w:lineRule="auto"/>
+              <w:jc w:val="right"/>
+            </w:pPr>
+            <w:r/>
+            <w:r>
+              <w:rPr>
+                <w:rFonts w:ascii="B Nazanin" w:hAnsi="B Nazanin" w:cs="B Nazanin" w:eastAsia="B Nazanin"/>
+                <w:b w:val="0"/>
+                <w:sz w:val="20"/>
+              </w:rPr>
+              <w:t>فراخوانی PortalPublic رزرو</w:t>
+            </w:r>
+          </w:p>
+        </w:tc>
+      </w:tr>
+    </w:tbl>
+    <w:p/>
+    <w:p>
+      <w:pPr>
+        <w:pStyle w:val="Heading2"/>
+        <w:bidi w:val="1"/>
+        <w:spacing w:after="160" w:line="360" w:lineRule="auto"/>
+        <w:jc w:val="right"/>
+      </w:pPr>
+      <w:r>
+        <w:rPr>
+          <w:rFonts w:ascii="B Nazanin" w:hAnsi="B Nazanin" w:cs="B Nazanin" w:eastAsia="B Nazanin"/>
+          <w:b/>
+          <w:color w:val="1F4E79"/>
+          <w:sz w:val="30"/>
+        </w:rPr>
+        <w:t>۱۴-۱. انواع قصد</w:t>
+      </w:r>
+    </w:p>
+    <w:tbl>
+      <w:tblPr>
+        <w:tblStyle w:val="TableGrid"/>
+        <w:tblW w:type="auto" w:w="0"/>
+        <w:jc w:val="center"/>
+        <w:tblLook w:firstColumn="1" w:firstRow="1" w:lastColumn="0" w:lastRow="0" w:noHBand="0" w:noVBand="1" w:val="04A0"/>
+      </w:tblPr>
+      <w:tblGrid>
+        <w:gridCol w:w="3324"/>
+        <w:gridCol w:w="3324"/>
+        <w:gridCol w:w="3324"/>
+      </w:tblGrid>
+      <w:tr>
+        <w:tc>
+          <w:tcPr>
+            <w:tcW w:type="dxa" w:w="3324"/>
+            <w:shd w:fill="DBEAFE" w:val="clear"/>
+          </w:tcPr>
+          <w:p>
+            <w:pPr>
+              <w:bidi w:val="1"/>
+              <w:spacing w:after="160" w:line="360" w:lineRule="auto"/>
+              <w:jc w:val="right"/>
+            </w:pPr>
+            <w:r/>
+            <w:r>
+              <w:rPr>
+                <w:rFonts w:ascii="B Nazanin" w:hAnsi="B Nazanin" w:cs="B Nazanin" w:eastAsia="B Nazanin"/>
+                <w:b/>
+                <w:sz w:val="22"/>
+              </w:rPr>
+              <w:t>kind</w:t>
+            </w:r>
+          </w:p>
+        </w:tc>
+        <w:tc>
+          <w:tcPr>
+            <w:tcW w:type="dxa" w:w="3324"/>
+            <w:shd w:fill="DBEAFE" w:val="clear"/>
+          </w:tcPr>
+          <w:p>
+            <w:pPr>
+              <w:bidi w:val="1"/>
+              <w:spacing w:after="160" w:line="360" w:lineRule="auto"/>
+              <w:jc w:val="right"/>
+            </w:pPr>
+            <w:r/>
+            <w:r>
+              <w:rPr>
+                <w:rFonts w:ascii="B Nazanin" w:hAnsi="B Nazanin" w:cs="B Nazanin" w:eastAsia="B Nazanin"/>
+                <w:b/>
+                <w:sz w:val="22"/>
+              </w:rPr>
+              <w:t>نمونه</w:t>
+            </w:r>
+          </w:p>
+        </w:tc>
+        <w:tc>
+          <w:tcPr>
+            <w:tcW w:type="dxa" w:w="3324"/>
+            <w:shd w:fill="DBEAFE" w:val="clear"/>
+          </w:tcPr>
+          <w:p>
+            <w:pPr>
+              <w:bidi w:val="1"/>
+              <w:spacing w:after="160" w:line="360" w:lineRule="auto"/>
+              <w:jc w:val="right"/>
+            </w:pPr>
+            <w:r/>
+            <w:r>
+              <w:rPr>
+                <w:rFonts w:ascii="B Nazanin" w:hAnsi="B Nazanin" w:cs="B Nazanin" w:eastAsia="B Nazanin"/>
+                <w:b/>
+                <w:sz w:val="22"/>
+              </w:rPr>
+              <w:t>رفتار</w:t>
+            </w:r>
+          </w:p>
+        </w:tc>
+      </w:tr>
+      <w:tr>
+        <w:tc>
+          <w:tcPr>
+            <w:tcW w:type="dxa" w:w="3324"/>
+          </w:tcPr>
+          <w:p>
+            <w:pPr>
+              <w:bidi w:val="1"/>
+              <w:spacing w:after="160" w:line="360" w:lineRule="auto"/>
+              <w:jc w:val="right"/>
+            </w:pPr>
+            <w:r/>
+            <w:r>
+              <w:rPr>
+                <w:rFonts w:ascii="B Nazanin" w:hAnsi="B Nazanin" w:cs="B Nazanin" w:eastAsia="B Nazanin"/>
+                <w:b w:val="0"/>
+                <w:sz w:val="20"/>
+              </w:rPr>
+              <w:t>list_slots</w:t>
+            </w:r>
+          </w:p>
+        </w:tc>
+        <w:tc>
+          <w:tcPr>
+            <w:tcW w:type="dxa" w:w="3324"/>
+          </w:tcPr>
+          <w:p>
+            <w:pPr>
+              <w:bidi w:val="1"/>
+              <w:spacing w:after="160" w:line="360" w:lineRule="auto"/>
+              <w:jc w:val="right"/>
+            </w:pPr>
+            <w:r/>
+            <w:r>
+              <w:rPr>
+                <w:rFonts w:ascii="B Nazanin" w:hAnsi="B Nazanin" w:cs="B Nazanin" w:eastAsia="B Nazanin"/>
+                <w:b w:val="0"/>
+                <w:sz w:val="20"/>
+              </w:rPr>
+              <w:t>نوبت‌های فردا / ۳۱ تیر</w:t>
+            </w:r>
+          </w:p>
+        </w:tc>
+        <w:tc>
+          <w:tcPr>
+            <w:tcW w:type="dxa" w:w="3324"/>
+          </w:tcPr>
+          <w:p>
+            <w:pPr>
+              <w:bidi w:val="1"/>
+              <w:spacing w:after="160" w:line="360" w:lineRule="auto"/>
+              <w:jc w:val="right"/>
+            </w:pPr>
+            <w:r/>
+            <w:r>
+              <w:rPr>
+                <w:rFonts w:ascii="B Nazanin" w:hAnsi="B Nazanin" w:cs="B Nazanin" w:eastAsia="B Nazanin"/>
+                <w:b w:val="0"/>
+                <w:sz w:val="20"/>
+              </w:rPr>
+              <w:t>لیست اسلات با دکمه</w:t>
+            </w:r>
+          </w:p>
+        </w:tc>
+      </w:tr>
+      <w:tr>
+        <w:tc>
+          <w:tcPr>
+            <w:tcW w:type="dxa" w:w="3324"/>
+          </w:tcPr>
+          <w:p>
+            <w:pPr>
+              <w:bidi w:val="1"/>
+              <w:spacing w:after="160" w:line="360" w:lineRule="auto"/>
+              <w:jc w:val="right"/>
+            </w:pPr>
+            <w:r/>
+            <w:r>
+              <w:rPr>
+                <w:rFonts w:ascii="B Nazanin" w:hAnsi="B Nazanin" w:cs="B Nazanin" w:eastAsia="B Nazanin"/>
+                <w:b w:val="0"/>
+                <w:sz w:val="20"/>
+              </w:rPr>
+              <w:t>book</w:t>
+            </w:r>
+          </w:p>
+        </w:tc>
+        <w:tc>
+          <w:tcPr>
+            <w:tcW w:type="dxa" w:w="3324"/>
+          </w:tcPr>
+          <w:p>
+            <w:pPr>
+              <w:bidi w:val="1"/>
+              <w:spacing w:after="160" w:line="360" w:lineRule="auto"/>
+              <w:jc w:val="right"/>
+            </w:pPr>
+            <w:r/>
+            <w:r>
+              <w:rPr>
+                <w:rFonts w:ascii="B Nazanin" w:hAnsi="B Nazanin" w:cs="B Nazanin" w:eastAsia="B Nazanin"/>
+                <w:b w:val="0"/>
+                <w:sz w:val="20"/>
+              </w:rPr>
+              <w:t>فردا ساعت ۱۸:۳۰ نوبت بگیر</w:t>
+            </w:r>
+          </w:p>
+        </w:tc>
+        <w:tc>
+          <w:tcPr>
+            <w:tcW w:type="dxa" w:w="3324"/>
+          </w:tcPr>
+          <w:p>
+            <w:pPr>
+              <w:bidi w:val="1"/>
+              <w:spacing w:after="160" w:line="360" w:lineRule="auto"/>
+              <w:jc w:val="right"/>
+            </w:pPr>
+            <w:r/>
+            <w:r>
+              <w:rPr>
+                <w:rFonts w:ascii="B Nazanin" w:hAnsi="B Nazanin" w:cs="B Nazanin" w:eastAsia="B Nazanin"/>
+                <w:b w:val="0"/>
+                <w:sz w:val="20"/>
+              </w:rPr>
+              <w:t>Create یا لیست همان روز</w:t>
+            </w:r>
+          </w:p>
+        </w:tc>
+      </w:tr>
+      <w:tr>
+        <w:tc>
+          <w:tcPr>
+            <w:tcW w:type="dxa" w:w="3324"/>
+          </w:tcPr>
+          <w:p>
+            <w:pPr>
+              <w:bidi w:val="1"/>
+              <w:spacing w:after="160" w:line="360" w:lineRule="auto"/>
+              <w:jc w:val="right"/>
+            </w:pPr>
+            <w:r/>
+            <w:r>
+              <w:rPr>
+                <w:rFonts w:ascii="B Nazanin" w:hAnsi="B Nazanin" w:cs="B Nazanin" w:eastAsia="B Nazanin"/>
+                <w:b w:val="0"/>
+                <w:sz w:val="20"/>
+              </w:rPr>
+              <w:t>my_bookings</w:t>
+            </w:r>
+          </w:p>
+        </w:tc>
+        <w:tc>
+          <w:tcPr>
+            <w:tcW w:type="dxa" w:w="3324"/>
+          </w:tcPr>
+          <w:p>
+            <w:pPr>
+              <w:bidi w:val="1"/>
+              <w:spacing w:after="160" w:line="360" w:lineRule="auto"/>
+              <w:jc w:val="right"/>
+            </w:pPr>
+            <w:r/>
+            <w:r>
+              <w:rPr>
+                <w:rFonts w:ascii="B Nazanin" w:hAnsi="B Nazanin" w:cs="B Nazanin" w:eastAsia="B Nazanin"/>
+                <w:b w:val="0"/>
+                <w:sz w:val="20"/>
+              </w:rPr>
+              <w:t>نوبت‌های من</w:t>
+            </w:r>
+          </w:p>
+        </w:tc>
+        <w:tc>
+          <w:tcPr>
+            <w:tcW w:type="dxa" w:w="3324"/>
+          </w:tcPr>
+          <w:p>
+            <w:pPr>
+              <w:bidi w:val="1"/>
+              <w:spacing w:after="160" w:line="360" w:lineRule="auto"/>
+              <w:jc w:val="right"/>
+            </w:pPr>
+            <w:r/>
+            <w:r>
+              <w:rPr>
+                <w:rFonts w:ascii="B Nazanin" w:hAnsi="B Nazanin" w:cs="B Nazanin" w:eastAsia="B Nazanin"/>
+                <w:b w:val="0"/>
+                <w:sz w:val="20"/>
+              </w:rPr>
+              <w:t>رزروهای فعال</w:t>
+            </w:r>
+          </w:p>
+        </w:tc>
+      </w:tr>
+      <w:tr>
+        <w:tc>
+          <w:tcPr>
+            <w:tcW w:type="dxa" w:w="3324"/>
+          </w:tcPr>
+          <w:p>
+            <w:pPr>
+              <w:bidi w:val="1"/>
+              <w:spacing w:after="160" w:line="360" w:lineRule="auto"/>
+              <w:jc w:val="right"/>
+            </w:pPr>
+            <w:r/>
+            <w:r>
+              <w:rPr>
+                <w:rFonts w:ascii="B Nazanin" w:hAnsi="B Nazanin" w:cs="B Nazanin" w:eastAsia="B Nazanin"/>
+                <w:b w:val="0"/>
+                <w:sz w:val="20"/>
+              </w:rPr>
+              <w:t>cancel</w:t>
+            </w:r>
+          </w:p>
+        </w:tc>
+        <w:tc>
+          <w:tcPr>
+            <w:tcW w:type="dxa" w:w="3324"/>
+          </w:tcPr>
+          <w:p>
+            <w:pPr>
+              <w:bidi w:val="1"/>
+              <w:spacing w:after="160" w:line="360" w:lineRule="auto"/>
+              <w:jc w:val="right"/>
+            </w:pPr>
+            <w:r/>
+            <w:r>
+              <w:rPr>
+                <w:rFonts w:ascii="B Nazanin" w:hAnsi="B Nazanin" w:cs="B Nazanin" w:eastAsia="B Nazanin"/>
+                <w:b w:val="0"/>
+                <w:sz w:val="20"/>
+              </w:rPr>
+              <w:t>لغو نوبت</w:t>
+            </w:r>
+          </w:p>
+        </w:tc>
+        <w:tc>
+          <w:tcPr>
+            <w:tcW w:type="dxa" w:w="3324"/>
+          </w:tcPr>
+          <w:p>
+            <w:pPr>
+              <w:bidi w:val="1"/>
+              <w:spacing w:after="160" w:line="360" w:lineRule="auto"/>
+              <w:jc w:val="right"/>
+            </w:pPr>
+            <w:r/>
+            <w:r>
+              <w:rPr>
+                <w:rFonts w:ascii="B Nazanin" w:hAnsi="B Nazanin" w:cs="B Nazanin" w:eastAsia="B Nazanin"/>
+                <w:b w:val="0"/>
+                <w:sz w:val="20"/>
+              </w:rPr>
+              <w:t>انتخاب برای لغو</w:t>
+            </w:r>
+          </w:p>
+        </w:tc>
+      </w:tr>
+      <w:tr>
+        <w:tc>
+          <w:tcPr>
+            <w:tcW w:type="dxa" w:w="3324"/>
+          </w:tcPr>
+          <w:p>
+            <w:pPr>
+              <w:bidi w:val="1"/>
+              <w:spacing w:after="160" w:line="360" w:lineRule="auto"/>
+              <w:jc w:val="right"/>
+            </w:pPr>
+            <w:r/>
+            <w:r>
+              <w:rPr>
+                <w:rFonts w:ascii="B Nazanin" w:hAnsi="B Nazanin" w:cs="B Nazanin" w:eastAsia="B Nazanin"/>
+                <w:b w:val="0"/>
+                <w:sz w:val="20"/>
+              </w:rPr>
+              <w:t>reschedule</w:t>
+            </w:r>
+          </w:p>
+        </w:tc>
+        <w:tc>
+          <w:tcPr>
+            <w:tcW w:type="dxa" w:w="3324"/>
+          </w:tcPr>
+          <w:p>
+            <w:pPr>
+              <w:bidi w:val="1"/>
+              <w:spacing w:after="160" w:line="360" w:lineRule="auto"/>
+              <w:jc w:val="right"/>
+            </w:pPr>
+            <w:r/>
+            <w:r>
+              <w:rPr>
+                <w:rFonts w:ascii="B Nazanin" w:hAnsi="B Nazanin" w:cs="B Nazanin" w:eastAsia="B Nazanin"/>
+                <w:b w:val="0"/>
+                <w:sz w:val="20"/>
+              </w:rPr>
+              <w:t>تغییر نوبت</w:t>
+            </w:r>
+          </w:p>
+        </w:tc>
+        <w:tc>
+          <w:tcPr>
+            <w:tcW w:type="dxa" w:w="3324"/>
+          </w:tcPr>
+          <w:p>
+            <w:pPr>
+              <w:bidi w:val="1"/>
+              <w:spacing w:after="160" w:line="360" w:lineRule="auto"/>
+              <w:jc w:val="right"/>
+            </w:pPr>
+            <w:r/>
+            <w:r>
+              <w:rPr>
+                <w:rFonts w:ascii="B Nazanin" w:hAnsi="B Nazanin" w:cs="B Nazanin" w:eastAsia="B Nazanin"/>
+                <w:b w:val="0"/>
+                <w:sz w:val="20"/>
+              </w:rPr>
+              <w:t>جابجایی اسلات</w:t>
+            </w:r>
+          </w:p>
+        </w:tc>
+      </w:tr>
+      <w:tr>
+        <w:tc>
+          <w:tcPr>
+            <w:tcW w:type="dxa" w:w="3324"/>
+          </w:tcPr>
+          <w:p>
+            <w:pPr>
+              <w:bidi w:val="1"/>
+              <w:spacing w:after="160" w:line="360" w:lineRule="auto"/>
+              <w:jc w:val="right"/>
+            </w:pPr>
+            <w:r/>
+            <w:r>
+              <w:rPr>
+                <w:rFonts w:ascii="B Nazanin" w:hAnsi="B Nazanin" w:cs="B Nazanin" w:eastAsia="B Nazanin"/>
+                <w:b w:val="0"/>
+                <w:sz w:val="20"/>
+              </w:rPr>
+              <w:t>none</w:t>
+            </w:r>
+          </w:p>
+        </w:tc>
+        <w:tc>
+          <w:tcPr>
+            <w:tcW w:type="dxa" w:w="3324"/>
+          </w:tcPr>
+          <w:p>
+            <w:pPr>
+              <w:bidi w:val="1"/>
+              <w:spacing w:after="160" w:line="360" w:lineRule="auto"/>
+              <w:jc w:val="right"/>
+            </w:pPr>
+            <w:r/>
+            <w:r>
+              <w:rPr>
+                <w:rFonts w:ascii="B Nazanin" w:hAnsi="B Nazanin" w:cs="B Nazanin" w:eastAsia="B Nazanin"/>
+                <w:b w:val="0"/>
+                <w:sz w:val="20"/>
+              </w:rPr>
+              <w:t>آدرس مطب؟</w:t>
+            </w:r>
+          </w:p>
+        </w:tc>
+        <w:tc>
+          <w:tcPr>
+            <w:tcW w:type="dxa" w:w="3324"/>
+          </w:tcPr>
+          <w:p>
+            <w:pPr>
+              <w:bidi w:val="1"/>
+              <w:spacing w:after="160" w:line="360" w:lineRule="auto"/>
+              <w:jc w:val="right"/>
+            </w:pPr>
+            <w:r/>
+            <w:r>
+              <w:rPr>
+                <w:rFonts w:ascii="B Nazanin" w:hAnsi="B Nazanin" w:cs="B Nazanin" w:eastAsia="B Nazanin"/>
+                <w:b w:val="0"/>
+                <w:sz w:val="20"/>
+              </w:rPr>
+              <w:t>می‌رود به RAG</w:t>
+            </w:r>
+          </w:p>
+        </w:tc>
+      </w:tr>
+    </w:tbl>
+    <w:p/>
+    <w:p>
+      <w:pPr>
+        <w:bidi w:val="1"/>
+        <w:spacing w:after="160" w:line="360" w:lineRule="auto"/>
+        <w:jc w:val="right"/>
+      </w:pPr>
+      <w:r>
+        <w:rPr>
+          <w:rFonts w:ascii="B Nazanin" w:hAnsi="B Nazanin" w:cs="B Nazanin" w:eastAsia="B Nazanin"/>
+          <w:b w:val="0"/>
+          <w:sz w:val="22"/>
+        </w:rPr>
+        <w:t>ضد مثبت کاذب: «لغو اشتراک» یا «جابجا کنید» بدون کلمه نوبت → none.</w:t>
+      </w:r>
+    </w:p>
+    <w:p>
+      <w:pPr>
+        <w:pStyle w:val="Heading2"/>
+        <w:bidi w:val="1"/>
+        <w:spacing w:after="160" w:line="360" w:lineRule="auto"/>
+        <w:jc w:val="right"/>
+      </w:pPr>
+      <w:r>
+        <w:rPr>
+          <w:rFonts w:ascii="B Nazanin" w:hAnsi="B Nazanin" w:cs="B Nazanin" w:eastAsia="B Nazanin"/>
+          <w:b/>
+          <w:color w:val="1F4E79"/>
+          <w:sz w:val="30"/>
+        </w:rPr>
+        <w:t>۱۴-۲. تاریخ شمسی مطلق</w:t>
+      </w:r>
+    </w:p>
+    <w:tbl>
+      <w:tblPr>
+        <w:tblStyle w:val="TableGrid"/>
+        <w:tblW w:type="auto" w:w="0"/>
+        <w:jc w:val="center"/>
+        <w:tblLook w:firstColumn="1" w:firstRow="1" w:lastColumn="0" w:lastRow="0" w:noHBand="0" w:noVBand="1" w:val="04A0"/>
+      </w:tblPr>
+      <w:tblGrid>
+        <w:gridCol w:w="4986"/>
+        <w:gridCol w:w="4986"/>
+      </w:tblGrid>
+      <w:tr>
+        <w:tc>
+          <w:tcPr>
+            <w:tcW w:type="dxa" w:w="4986"/>
+            <w:shd w:fill="DBEAFE" w:val="clear"/>
+          </w:tcPr>
+          <w:p>
+            <w:pPr>
+              <w:bidi w:val="1"/>
+              <w:spacing w:after="160" w:line="360" w:lineRule="auto"/>
+              <w:jc w:val="right"/>
+            </w:pPr>
+            <w:r/>
+            <w:r>
+              <w:rPr>
+                <w:rFonts w:ascii="B Nazanin" w:hAnsi="B Nazanin" w:cs="B Nazanin" w:eastAsia="B Nazanin"/>
+                <w:b/>
+                <w:sz w:val="22"/>
+              </w:rPr>
+              <w:t>فرم</w:t>
+            </w:r>
+          </w:p>
+        </w:tc>
+        <w:tc>
+          <w:tcPr>
+            <w:tcW w:type="dxa" w:w="4986"/>
+            <w:shd w:fill="DBEAFE" w:val="clear"/>
+          </w:tcPr>
+          <w:p>
+            <w:pPr>
+              <w:bidi w:val="1"/>
+              <w:spacing w:after="160" w:line="360" w:lineRule="auto"/>
+              <w:jc w:val="right"/>
+            </w:pPr>
+            <w:r/>
+            <w:r>
+              <w:rPr>
+                <w:rFonts w:ascii="B Nazanin" w:hAnsi="B Nazanin" w:cs="B Nazanin" w:eastAsia="B Nazanin"/>
+                <w:b/>
+                <w:sz w:val="22"/>
+              </w:rPr>
+              <w:t>مثال</w:t>
+            </w:r>
+          </w:p>
+        </w:tc>
+      </w:tr>
+      <w:tr>
+        <w:tc>
+          <w:tcPr>
+            <w:tcW w:type="dxa" w:w="4986"/>
+          </w:tcPr>
+          <w:p>
+            <w:pPr>
+              <w:bidi w:val="1"/>
+              <w:spacing w:after="160" w:line="360" w:lineRule="auto"/>
+              <w:jc w:val="right"/>
+            </w:pPr>
+            <w:r/>
+            <w:r>
+              <w:rPr>
+                <w:rFonts w:ascii="B Nazanin" w:hAnsi="B Nazanin" w:cs="B Nazanin" w:eastAsia="B Nazanin"/>
+                <w:b w:val="0"/>
+                <w:sz w:val="20"/>
+              </w:rPr>
+              <w:t>Y/M/D</w:t>
+            </w:r>
+          </w:p>
+        </w:tc>
+        <w:tc>
+          <w:tcPr>
+            <w:tcW w:type="dxa" w:w="4986"/>
+          </w:tcPr>
+          <w:p>
+            <w:pPr>
+              <w:bidi w:val="1"/>
+              <w:spacing w:after="160" w:line="360" w:lineRule="auto"/>
+              <w:jc w:val="right"/>
+            </w:pPr>
+            <w:r/>
+            <w:r>
+              <w:rPr>
+                <w:rFonts w:ascii="B Nazanin" w:hAnsi="B Nazanin" w:cs="B Nazanin" w:eastAsia="B Nazanin"/>
+                <w:b w:val="0"/>
+                <w:sz w:val="20"/>
+              </w:rPr>
+              <w:t>1405/04/31 یا ۱۴۰۵-۴-۳۱</w:t>
+            </w:r>
+          </w:p>
+        </w:tc>
+      </w:tr>
+      <w:tr>
+        <w:tc>
+          <w:tcPr>
+            <w:tcW w:type="dxa" w:w="4986"/>
+          </w:tcPr>
+          <w:p>
+            <w:pPr>
+              <w:bidi w:val="1"/>
+              <w:spacing w:after="160" w:line="360" w:lineRule="auto"/>
+              <w:jc w:val="right"/>
+            </w:pPr>
+            <w:r/>
+            <w:r>
+              <w:rPr>
+                <w:rFonts w:ascii="B Nazanin" w:hAnsi="B Nazanin" w:cs="B Nazanin" w:eastAsia="B Nazanin"/>
+                <w:b w:val="0"/>
+                <w:sz w:val="20"/>
+              </w:rPr>
+              <w:t>D/M/Y</w:t>
+            </w:r>
+          </w:p>
+        </w:tc>
+        <w:tc>
+          <w:tcPr>
+            <w:tcW w:type="dxa" w:w="4986"/>
+          </w:tcPr>
+          <w:p>
+            <w:pPr>
+              <w:bidi w:val="1"/>
+              <w:spacing w:after="160" w:line="360" w:lineRule="auto"/>
+              <w:jc w:val="right"/>
+            </w:pPr>
+            <w:r/>
+            <w:r>
+              <w:rPr>
+                <w:rFonts w:ascii="B Nazanin" w:hAnsi="B Nazanin" w:cs="B Nazanin" w:eastAsia="B Nazanin"/>
+                <w:b w:val="0"/>
+                <w:sz w:val="20"/>
+              </w:rPr>
+              <w:t>31/04/1405</w:t>
+            </w:r>
+          </w:p>
+        </w:tc>
+      </w:tr>
+      <w:tr>
+        <w:tc>
+          <w:tcPr>
+            <w:tcW w:type="dxa" w:w="4986"/>
+          </w:tcPr>
+          <w:p>
+            <w:pPr>
+              <w:bidi w:val="1"/>
+              <w:spacing w:after="160" w:line="360" w:lineRule="auto"/>
+              <w:jc w:val="right"/>
+            </w:pPr>
+            <w:r/>
+            <w:r>
+              <w:rPr>
+                <w:rFonts w:ascii="B Nazanin" w:hAnsi="B Nazanin" w:cs="B Nazanin" w:eastAsia="B Nazanin"/>
+                <w:b w:val="0"/>
+                <w:sz w:val="20"/>
+              </w:rPr>
+              <w:t>روز + ماه + سال</w:t>
+            </w:r>
+          </w:p>
+        </w:tc>
+        <w:tc>
+          <w:tcPr>
+            <w:tcW w:type="dxa" w:w="4986"/>
+          </w:tcPr>
+          <w:p>
+            <w:pPr>
+              <w:bidi w:val="1"/>
+              <w:spacing w:after="160" w:line="360" w:lineRule="auto"/>
+              <w:jc w:val="right"/>
+            </w:pPr>
+            <w:r/>
+            <w:r>
+              <w:rPr>
+                <w:rFonts w:ascii="B Nazanin" w:hAnsi="B Nazanin" w:cs="B Nazanin" w:eastAsia="B Nazanin"/>
+                <w:b w:val="0"/>
+                <w:sz w:val="20"/>
+              </w:rPr>
+              <w:t>۳۱ تیر ۱۴۰۵</w:t>
+            </w:r>
+          </w:p>
+        </w:tc>
+      </w:tr>
+      <w:tr>
+        <w:tc>
+          <w:tcPr>
+            <w:tcW w:type="dxa" w:w="4986"/>
+          </w:tcPr>
+          <w:p>
+            <w:pPr>
+              <w:bidi w:val="1"/>
+              <w:spacing w:after="160" w:line="360" w:lineRule="auto"/>
+              <w:jc w:val="right"/>
+            </w:pPr>
+            <w:r/>
+            <w:r>
+              <w:rPr>
+                <w:rFonts w:ascii="B Nazanin" w:hAnsi="B Nazanin" w:cs="B Nazanin" w:eastAsia="B Nazanin"/>
+                <w:b w:val="0"/>
+                <w:sz w:val="20"/>
+              </w:rPr>
+              <w:t>روز + ماه بدون سال</w:t>
+            </w:r>
+          </w:p>
+        </w:tc>
+        <w:tc>
+          <w:tcPr>
+            <w:tcW w:type="dxa" w:w="4986"/>
+          </w:tcPr>
+          <w:p>
+            <w:pPr>
+              <w:bidi w:val="1"/>
+              <w:spacing w:after="160" w:line="360" w:lineRule="auto"/>
+              <w:jc w:val="right"/>
+            </w:pPr>
+            <w:r/>
+            <w:r>
+              <w:rPr>
+                <w:rFonts w:ascii="B Nazanin" w:hAnsi="B Nazanin" w:cs="B Nazanin" w:eastAsia="B Nazanin"/>
+                <w:b w:val="0"/>
+                <w:sz w:val="20"/>
+              </w:rPr>
+              <w:t>۱۵ تیر → سال جاری؛ اگر گذشته سال بعد</w:t>
+            </w:r>
+          </w:p>
+        </w:tc>
+      </w:tr>
+    </w:tbl>
+    <w:p/>
+    <w:p>
+      <w:pPr>
+        <w:pStyle w:val="ListBullet"/>
+        <w:bidi w:val="1"/>
+        <w:spacing w:after="160" w:line="360" w:lineRule="auto"/>
+        <w:jc w:val="right"/>
+      </w:pPr>
+      <w:r>
+        <w:rPr>
+          <w:rFonts w:ascii="B Nazanin" w:hAnsi="B Nazanin" w:cs="B Nazanin" w:eastAsia="B Nazanin"/>
+          <w:b w:val="0"/>
+          <w:sz w:val="24"/>
+        </w:rPr>
+        <w:t>کتابخانه jalaali-js؛ خروجی dayKey میلادی YYYY-MM-DD برای API</w:t>
+      </w:r>
+    </w:p>
+    <w:p>
+      <w:pPr>
+        <w:pStyle w:val="ListBullet"/>
+        <w:bidi w:val="1"/>
+        <w:spacing w:after="160" w:line="360" w:lineRule="auto"/>
+        <w:jc w:val="right"/>
+      </w:pPr>
+      <w:r>
+        <w:rPr>
+          <w:rFonts w:ascii="B Nazanin" w:hAnsi="B Nazanin" w:cs="B Nazanin" w:eastAsia="B Nazanin"/>
+          <w:b w:val="0"/>
+          <w:sz w:val="24"/>
+        </w:rPr>
+        <w:t>مرز حرفی برای تیر/مهر/دی تا «دیگر» به‌اشتباه دی نشود</w:t>
+      </w:r>
+    </w:p>
+    <w:p>
+      <w:pPr>
+        <w:pStyle w:val="ListBullet"/>
+        <w:bidi w:val="1"/>
+        <w:spacing w:after="160" w:line="360" w:lineRule="auto"/>
+        <w:jc w:val="right"/>
+      </w:pPr>
+      <w:r>
+        <w:rPr>
+          <w:rFonts w:ascii="B Nazanin" w:hAnsi="B Nazanin" w:cs="B Nazanin" w:eastAsia="B Nazanin"/>
+          <w:b w:val="0"/>
+          <w:sz w:val="24"/>
+        </w:rPr>
+        <w:t>روز نامعتبر → dateParseError قبل از OTP</w:t>
+      </w:r>
+    </w:p>
+    <w:p>
+      <w:pPr>
+        <w:pStyle w:val="Heading2"/>
+        <w:bidi w:val="1"/>
+        <w:spacing w:after="160" w:line="360" w:lineRule="auto"/>
+        <w:jc w:val="right"/>
+      </w:pPr>
+      <w:r>
+        <w:rPr>
+          <w:rFonts w:ascii="B Nazanin" w:hAnsi="B Nazanin" w:cs="B Nazanin" w:eastAsia="B Nazanin"/>
+          <w:b/>
+          <w:color w:val="1F4E79"/>
+          <w:sz w:val="30"/>
+        </w:rPr>
+        <w:t>۱۴-۳. تاریخ نسبی و روز هفته</w:t>
+      </w:r>
+    </w:p>
+    <w:tbl>
+      <w:tblPr>
+        <w:tblStyle w:val="TableGrid"/>
+        <w:tblW w:type="auto" w:w="0"/>
+        <w:jc w:val="center"/>
+        <w:tblLook w:firstColumn="1" w:firstRow="1" w:lastColumn="0" w:lastRow="0" w:noHBand="0" w:noVBand="1" w:val="04A0"/>
+      </w:tblPr>
+      <w:tblGrid>
+        <w:gridCol w:w="3324"/>
+        <w:gridCol w:w="3324"/>
+        <w:gridCol w:w="3324"/>
+      </w:tblGrid>
+      <w:tr>
+        <w:tc>
+          <w:tcPr>
+            <w:tcW w:type="dxa" w:w="3324"/>
+            <w:shd w:fill="DBEAFE" w:val="clear"/>
+          </w:tcPr>
+          <w:p>
+            <w:pPr>
+              <w:bidi w:val="1"/>
+              <w:spacing w:after="160" w:line="360" w:lineRule="auto"/>
+              <w:jc w:val="right"/>
+            </w:pPr>
+            <w:r/>
+            <w:r>
+              <w:rPr>
+                <w:rFonts w:ascii="B Nazanin" w:hAnsi="B Nazanin" w:cs="B Nazanin" w:eastAsia="B Nazanin"/>
+                <w:b/>
+                <w:sz w:val="22"/>
+              </w:rPr>
+              <w:t>الگو</w:t>
+            </w:r>
+          </w:p>
+        </w:tc>
+        <w:tc>
+          <w:tcPr>
+            <w:tcW w:type="dxa" w:w="3324"/>
+            <w:shd w:fill="DBEAFE" w:val="clear"/>
+          </w:tcPr>
+          <w:p>
+            <w:pPr>
+              <w:bidi w:val="1"/>
+              <w:spacing w:after="160" w:line="360" w:lineRule="auto"/>
+              <w:jc w:val="right"/>
+            </w:pPr>
+            <w:r/>
+            <w:r>
+              <w:rPr>
+                <w:rFonts w:ascii="B Nazanin" w:hAnsi="B Nazanin" w:cs="B Nazanin" w:eastAsia="B Nazanin"/>
+                <w:b/>
+                <w:sz w:val="22"/>
+              </w:rPr>
+              <w:t>مثال</w:t>
+            </w:r>
+          </w:p>
+        </w:tc>
+        <w:tc>
+          <w:tcPr>
+            <w:tcW w:type="dxa" w:w="3324"/>
+            <w:shd w:fill="DBEAFE" w:val="clear"/>
+          </w:tcPr>
+          <w:p>
+            <w:pPr>
+              <w:bidi w:val="1"/>
+              <w:spacing w:after="160" w:line="360" w:lineRule="auto"/>
+              <w:jc w:val="right"/>
+            </w:pPr>
+            <w:r/>
+            <w:r>
+              <w:rPr>
+                <w:rFonts w:ascii="B Nazanin" w:hAnsi="B Nazanin" w:cs="B Nazanin" w:eastAsia="B Nazanin"/>
+                <w:b/>
+                <w:sz w:val="22"/>
+              </w:rPr>
+              <w:t>نتیجه</w:t>
+            </w:r>
+          </w:p>
+        </w:tc>
+      </w:tr>
+      <w:tr>
+        <w:tc>
+          <w:tcPr>
+            <w:tcW w:type="dxa" w:w="3324"/>
+          </w:tcPr>
+          <w:p>
+            <w:pPr>
+              <w:bidi w:val="1"/>
+              <w:spacing w:after="160" w:line="360" w:lineRule="auto"/>
+              <w:jc w:val="right"/>
+            </w:pPr>
+            <w:r/>
+            <w:r>
+              <w:rPr>
+                <w:rFonts w:ascii="B Nazanin" w:hAnsi="B Nazanin" w:cs="B Nazanin" w:eastAsia="B Nazanin"/>
+                <w:b w:val="0"/>
+                <w:sz w:val="20"/>
+              </w:rPr>
+              <w:t>امروز / فردا / پس‌فردا</w:t>
+            </w:r>
+          </w:p>
+        </w:tc>
+        <w:tc>
+          <w:tcPr>
+            <w:tcW w:type="dxa" w:w="3324"/>
+          </w:tcPr>
+          <w:p>
+            <w:pPr>
+              <w:bidi w:val="1"/>
+              <w:spacing w:after="160" w:line="360" w:lineRule="auto"/>
+              <w:jc w:val="right"/>
+            </w:pPr>
+            <w:r/>
+            <w:r>
+              <w:rPr>
+                <w:rFonts w:ascii="B Nazanin" w:hAnsi="B Nazanin" w:cs="B Nazanin" w:eastAsia="B Nazanin"/>
+                <w:b w:val="0"/>
+                <w:sz w:val="20"/>
+              </w:rPr>
+              <w:t>نوبت‌های فردا</w:t>
+            </w:r>
+          </w:p>
+        </w:tc>
+        <w:tc>
+          <w:tcPr>
+            <w:tcW w:type="dxa" w:w="3324"/>
+          </w:tcPr>
+          <w:p>
+            <w:pPr>
+              <w:bidi w:val="1"/>
+              <w:spacing w:after="160" w:line="360" w:lineRule="auto"/>
+              <w:jc w:val="right"/>
+            </w:pPr>
+            <w:r/>
+            <w:r>
+              <w:rPr>
+                <w:rFonts w:ascii="B Nazanin" w:hAnsi="B Nazanin" w:cs="B Nazanin" w:eastAsia="B Nazanin"/>
+                <w:b w:val="0"/>
+                <w:sz w:val="20"/>
+              </w:rPr>
+              <w:t>offset 0 / 1 / 2</w:t>
+            </w:r>
+          </w:p>
+        </w:tc>
+      </w:tr>
+      <w:tr>
+        <w:tc>
+          <w:tcPr>
+            <w:tcW w:type="dxa" w:w="3324"/>
+          </w:tcPr>
+          <w:p>
+            <w:pPr>
+              <w:bidi w:val="1"/>
+              <w:spacing w:after="160" w:line="360" w:lineRule="auto"/>
+              <w:jc w:val="right"/>
+            </w:pPr>
+            <w:r/>
+            <w:r>
+              <w:rPr>
+                <w:rFonts w:ascii="B Nazanin" w:hAnsi="B Nazanin" w:cs="B Nazanin" w:eastAsia="B Nazanin"/>
+                <w:b w:val="0"/>
+                <w:sz w:val="20"/>
+              </w:rPr>
+              <w:t>N روز بعد</w:t>
+            </w:r>
+          </w:p>
+        </w:tc>
+        <w:tc>
+          <w:tcPr>
+            <w:tcW w:type="dxa" w:w="3324"/>
+          </w:tcPr>
+          <w:p>
+            <w:pPr>
+              <w:bidi w:val="1"/>
+              <w:spacing w:after="160" w:line="360" w:lineRule="auto"/>
+              <w:jc w:val="right"/>
+            </w:pPr>
+            <w:r/>
+            <w:r>
+              <w:rPr>
+                <w:rFonts w:ascii="B Nazanin" w:hAnsi="B Nazanin" w:cs="B Nazanin" w:eastAsia="B Nazanin"/>
+                <w:b w:val="0"/>
+                <w:sz w:val="20"/>
+              </w:rPr>
+              <w:t>۴ روز بعد، بعد از ۳ روز</w:t>
+            </w:r>
+          </w:p>
+        </w:tc>
+        <w:tc>
+          <w:tcPr>
+            <w:tcW w:type="dxa" w:w="3324"/>
+          </w:tcPr>
+          <w:p>
+            <w:pPr>
+              <w:bidi w:val="1"/>
+              <w:spacing w:after="160" w:line="360" w:lineRule="auto"/>
+              <w:jc w:val="right"/>
+            </w:pPr>
+            <w:r/>
+            <w:r>
+              <w:rPr>
+                <w:rFonts w:ascii="B Nazanin" w:hAnsi="B Nazanin" w:cs="B Nazanin" w:eastAsia="B Nazanin"/>
+                <w:b w:val="0"/>
+                <w:sz w:val="20"/>
+              </w:rPr>
+              <w:t>offset N (۰…۶۰)</w:t>
+            </w:r>
+          </w:p>
+        </w:tc>
+      </w:tr>
+      <w:tr>
+        <w:tc>
+          <w:tcPr>
+            <w:tcW w:type="dxa" w:w="3324"/>
+          </w:tcPr>
+          <w:p>
+            <w:pPr>
+              <w:bidi w:val="1"/>
+              <w:spacing w:after="160" w:line="360" w:lineRule="auto"/>
+              <w:jc w:val="right"/>
+            </w:pPr>
+            <w:r/>
+            <w:r>
+              <w:rPr>
+                <w:rFonts w:ascii="B Nazanin" w:hAnsi="B Nazanin" w:cs="B Nazanin" w:eastAsia="B Nazanin"/>
+                <w:b w:val="0"/>
+                <w:sz w:val="20"/>
+              </w:rPr>
+              <w:t>روز هفته + بعد</w:t>
+            </w:r>
+          </w:p>
+        </w:tc>
+        <w:tc>
+          <w:tcPr>
+            <w:tcW w:type="dxa" w:w="3324"/>
+          </w:tcPr>
+          <w:p>
+            <w:pPr>
+              <w:bidi w:val="1"/>
+              <w:spacing w:after="160" w:line="360" w:lineRule="auto"/>
+              <w:jc w:val="right"/>
+            </w:pPr>
+            <w:r/>
+            <w:r>
+              <w:rPr>
+                <w:rFonts w:ascii="B Nazanin" w:hAnsi="B Nazanin" w:cs="B Nazanin" w:eastAsia="B Nazanin"/>
+                <w:b w:val="0"/>
+                <w:sz w:val="20"/>
+              </w:rPr>
+              <w:t>شنبه بعد، بعد از یکشنبه</w:t>
+            </w:r>
+          </w:p>
+        </w:tc>
+        <w:tc>
+          <w:tcPr>
+            <w:tcW w:type="dxa" w:w="3324"/>
+          </w:tcPr>
+          <w:p>
+            <w:pPr>
+              <w:bidi w:val="1"/>
+              <w:spacing w:after="160" w:line="360" w:lineRule="auto"/>
+              <w:jc w:val="right"/>
+            </w:pPr>
+            <w:r/>
+            <w:r>
+              <w:rPr>
+                <w:rFonts w:ascii="B Nazanin" w:hAnsi="B Nazanin" w:cs="B Nazanin" w:eastAsia="B Nazanin"/>
+                <w:b w:val="0"/>
+                <w:sz w:val="20"/>
+              </w:rPr>
+              <w:t>Occurance بعدی (+۷ اگر امروز همان روز)</w:t>
+            </w:r>
+          </w:p>
+        </w:tc>
+      </w:tr>
+      <w:tr>
+        <w:tc>
+          <w:tcPr>
+            <w:tcW w:type="dxa" w:w="3324"/>
+          </w:tcPr>
+          <w:p>
+            <w:pPr>
+              <w:bidi w:val="1"/>
+              <w:spacing w:after="160" w:line="360" w:lineRule="auto"/>
+              <w:jc w:val="right"/>
+            </w:pPr>
+            <w:r/>
+            <w:r>
+              <w:rPr>
+                <w:rFonts w:ascii="B Nazanin" w:hAnsi="B Nazanin" w:cs="B Nazanin" w:eastAsia="B Nazanin"/>
+                <w:b w:val="0"/>
+                <w:sz w:val="20"/>
+              </w:rPr>
+              <w:t>این + روز هفته</w:t>
+            </w:r>
+          </w:p>
+        </w:tc>
+        <w:tc>
+          <w:tcPr>
+            <w:tcW w:type="dxa" w:w="3324"/>
+          </w:tcPr>
+          <w:p>
+            <w:pPr>
+              <w:bidi w:val="1"/>
+              <w:spacing w:after="160" w:line="360" w:lineRule="auto"/>
+              <w:jc w:val="right"/>
+            </w:pPr>
+            <w:r/>
+            <w:r>
+              <w:rPr>
+                <w:rFonts w:ascii="B Nazanin" w:hAnsi="B Nazanin" w:cs="B Nazanin" w:eastAsia="B Nazanin"/>
+                <w:b w:val="0"/>
+                <w:sz w:val="20"/>
+              </w:rPr>
+              <w:t>این شنبه</w:t>
+            </w:r>
+          </w:p>
+        </w:tc>
+        <w:tc>
+          <w:tcPr>
+            <w:tcW w:type="dxa" w:w="3324"/>
+          </w:tcPr>
+          <w:p>
+            <w:pPr>
+              <w:bidi w:val="1"/>
+              <w:spacing w:after="160" w:line="360" w:lineRule="auto"/>
+              <w:jc w:val="right"/>
+            </w:pPr>
+            <w:r/>
+            <w:r>
+              <w:rPr>
+                <w:rFonts w:ascii="B Nazanin" w:hAnsi="B Nazanin" w:cs="B Nazanin" w:eastAsia="B Nazanin"/>
+                <w:b w:val="0"/>
+                <w:sz w:val="20"/>
+              </w:rPr>
+              <w:t>نزدیک‌ترین همان روز</w:t>
+            </w:r>
+          </w:p>
+        </w:tc>
+      </w:tr>
+      <w:tr>
+        <w:tc>
+          <w:tcPr>
+            <w:tcW w:type="dxa" w:w="3324"/>
+          </w:tcPr>
+          <w:p>
+            <w:pPr>
+              <w:bidi w:val="1"/>
+              <w:spacing w:after="160" w:line="360" w:lineRule="auto"/>
+              <w:jc w:val="right"/>
+            </w:pPr>
+            <w:r/>
+            <w:r>
+              <w:rPr>
+                <w:rFonts w:ascii="B Nazanin" w:hAnsi="B Nazanin" w:cs="B Nazanin" w:eastAsia="B Nazanin"/>
+                <w:b w:val="0"/>
+                <w:sz w:val="20"/>
+              </w:rPr>
+              <w:t>فقط روز هفته</w:t>
+            </w:r>
+          </w:p>
+        </w:tc>
+        <w:tc>
+          <w:tcPr>
+            <w:tcW w:type="dxa" w:w="3324"/>
+          </w:tcPr>
+          <w:p>
+            <w:pPr>
+              <w:bidi w:val="1"/>
+              <w:spacing w:after="160" w:line="360" w:lineRule="auto"/>
+              <w:jc w:val="right"/>
+            </w:pPr>
+            <w:r/>
+            <w:r>
+              <w:rPr>
+                <w:rFonts w:ascii="B Nazanin" w:hAnsi="B Nazanin" w:cs="B Nazanin" w:eastAsia="B Nazanin"/>
+                <w:b w:val="0"/>
+                <w:sz w:val="20"/>
+              </w:rPr>
+              <w:t>نوبت‌های پنجشنبه؟</w:t>
+            </w:r>
+          </w:p>
+        </w:tc>
+        <w:tc>
+          <w:tcPr>
+            <w:tcW w:type="dxa" w:w="3324"/>
+          </w:tcPr>
+          <w:p>
+            <w:pPr>
+              <w:bidi w:val="1"/>
+              <w:spacing w:after="160" w:line="360" w:lineRule="auto"/>
+              <w:jc w:val="right"/>
+            </w:pPr>
+            <w:r/>
+            <w:r>
+              <w:rPr>
+                <w:rFonts w:ascii="B Nazanin" w:hAnsi="B Nazanin" w:cs="B Nazanin" w:eastAsia="B Nazanin"/>
+                <w:b w:val="0"/>
+                <w:sz w:val="20"/>
+              </w:rPr>
+              <w:t>مثل mode this؛ علائم ؟ نرمال می‌شوند</w:t>
+            </w:r>
+          </w:p>
+        </w:tc>
+      </w:tr>
+    </w:tbl>
+    <w:p/>
+    <w:p>
+      <w:pPr>
+        <w:bidi w:val="1"/>
+        <w:spacing w:after="160" w:line="360" w:lineRule="auto"/>
+        <w:jc w:val="right"/>
+      </w:pPr>
+      <w:r>
+        <w:rPr>
+          <w:rFonts w:ascii="B Nazanin" w:hAnsi="B Nazanin" w:cs="B Nazanin" w:eastAsia="B Nazanin"/>
+          <w:b w:val="0"/>
+          <w:sz w:val="24"/>
+        </w:rPr>
+        <w:t>اولویت: شمسی مطلق &gt; نسبی. N&gt;60 → خطا (نه برگشت بی‌صدا به امروز). «هفته بعد» هنوز پشتیبانی نمی‌شود.</w:t>
+      </w:r>
+    </w:p>
+    <w:p>
+      <w:pPr>
+        <w:pStyle w:val="Heading2"/>
+        <w:bidi w:val="1"/>
+        <w:spacing w:after="160" w:line="360" w:lineRule="auto"/>
+        <w:jc w:val="right"/>
+      </w:pPr>
+      <w:r>
+        <w:rPr>
+          <w:rFonts w:ascii="B Nazanin" w:hAnsi="B Nazanin" w:cs="B Nazanin" w:eastAsia="B Nazanin"/>
+          <w:b/>
+          <w:color w:val="1F4E79"/>
+          <w:sz w:val="30"/>
+        </w:rPr>
+        <w:t>۱۴-۴. مثال end-to-end</w:t>
+      </w:r>
+    </w:p>
+    <w:p>
+      <w:pPr>
+        <w:pStyle w:val="ListBullet"/>
+        <w:bidi w:val="1"/>
+        <w:spacing w:after="160" w:line="360" w:lineRule="auto"/>
+        <w:jc w:val="right"/>
+      </w:pPr>
+      <w:r>
+        <w:rPr>
+          <w:rFonts w:ascii="B Nazanin" w:hAnsi="B Nazanin" w:cs="B Nazanin" w:eastAsia="B Nazanin"/>
+          <w:b w:val="0"/>
+          <w:sz w:val="24"/>
+        </w:rPr>
+        <w:t>«نوبت‌های شنبه بعد» → list_slots → auth → OpenSlots → دکمه Create</w:t>
+      </w:r>
+    </w:p>
+    <w:p>
+      <w:pPr>
+        <w:pStyle w:val="ListBullet"/>
+        <w:bidi w:val="1"/>
+        <w:spacing w:after="160" w:line="360" w:lineRule="auto"/>
+        <w:jc w:val="right"/>
+      </w:pPr>
+      <w:r>
+        <w:rPr>
+          <w:rFonts w:ascii="B Nazanin" w:hAnsi="B Nazanin" w:cs="B Nazanin" w:eastAsia="B Nazanin"/>
+          <w:b w:val="0"/>
+          <w:sz w:val="24"/>
+        </w:rPr>
+        <w:t>«۳۲ فروردین ۱۴۰۵ نوبت» → dateParseError بدون باز شدن مودال</w:t>
+      </w:r>
+    </w:p>
+    <w:p>
+      <w:pPr>
+        <w:pStyle w:val="ListBullet"/>
+        <w:bidi w:val="1"/>
+        <w:spacing w:after="160" w:line="360" w:lineRule="auto"/>
+        <w:jc w:val="right"/>
+      </w:pPr>
+      <w:r>
+        <w:rPr>
+          <w:rFonts w:ascii="B Nazanin" w:hAnsi="B Nazanin" w:cs="B Nazanin" w:eastAsia="B Nazanin"/>
+          <w:b w:val="0"/>
+          <w:sz w:val="24"/>
+        </w:rPr>
+        <w:t>ساعت: ۱۸:۳۰ یا ساعت ۹ → timeHm؛ slotMatchesTime با Date محلی</w:t>
+      </w:r>
+    </w:p>
+    <w:p>
+      <w:pPr>
+        <w:pStyle w:val="Heading1"/>
+        <w:bidi w:val="1"/>
+        <w:spacing w:after="160" w:line="360" w:lineRule="auto"/>
+        <w:jc w:val="right"/>
+      </w:pPr>
+      <w:r>
+        <w:rPr>
+          <w:rFonts w:ascii="B Nazanin" w:hAnsi="B Nazanin" w:cs="B Nazanin" w:eastAsia="B Nazanin"/>
+          <w:b/>
+          <w:color w:val="1F4E79"/>
+          <w:sz w:val="36"/>
+        </w:rPr>
+        <w:t>فصل ۱۵ — احراز هویت رزرو (OTP موبایل)</w:t>
+      </w:r>
+    </w:p>
+    <w:p>
+      <w:pPr>
+        <w:bidi w:val="1"/>
+        <w:spacing w:after="160" w:line="360" w:lineRule="auto"/>
+        <w:jc w:val="right"/>
+      </w:pPr>
+      <w:r>
+        <w:rPr>
+          <w:rFonts w:ascii="B Nazanin" w:hAnsi="B Nazanin" w:cs="B Nazanin" w:eastAsia="B Nazanin"/>
+          <w:b w:val="0"/>
+          <w:sz w:val="24"/>
+        </w:rPr>
+        <w:t>UI: PortalAuthModal · Backend: BookingOtpRequest / BookingOtpVerify / CompleteProfile</w:t>
+      </w:r>
+    </w:p>
+    <w:p>
+      <w:pPr>
+        <w:bidi w:val="0"/>
+        <w:spacing w:before="80" w:after="200"/>
+        <w:jc w:val="left"/>
+        <w:shd w:fill="F1F5F9" w:val="clear"/>
+      </w:pPr>
+      <w:r>
+        <w:rPr>
+          <w:rFonts w:ascii="Consolas" w:hAnsi="Consolas" w:cs="Consolas" w:eastAsia="Consolas"/>
+          <w:b w:val="0"/>
+          <w:sz w:val="18"/>
+        </w:rPr>
+        <w:t>phone → otp → confirm | profile → ادامه pendingIntent</w:t>
+      </w:r>
+    </w:p>
+    <w:tbl>
+      <w:tblPr>
+        <w:tblStyle w:val="TableGrid"/>
+        <w:tblW w:type="auto" w:w="0"/>
+        <w:jc w:val="center"/>
+        <w:tblLook w:firstColumn="1" w:firstRow="1" w:lastColumn="0" w:lastRow="0" w:noHBand="0" w:noVBand="1" w:val="04A0"/>
+      </w:tblPr>
+      <w:tblGrid>
+        <w:gridCol w:w="3324"/>
+        <w:gridCol w:w="3324"/>
+        <w:gridCol w:w="3324"/>
+      </w:tblGrid>
+      <w:tr>
+        <w:tc>
+          <w:tcPr>
+            <w:tcW w:type="dxa" w:w="3324"/>
+            <w:shd w:fill="DBEAFE" w:val="clear"/>
+          </w:tcPr>
+          <w:p>
+            <w:pPr>
+              <w:bidi w:val="1"/>
+              <w:spacing w:after="160" w:line="360" w:lineRule="auto"/>
+              <w:jc w:val="right"/>
+            </w:pPr>
+            <w:r/>
+            <w:r>
+              <w:rPr>
+                <w:rFonts w:ascii="B Nazanin" w:hAnsi="B Nazanin" w:cs="B Nazanin" w:eastAsia="B Nazanin"/>
+                <w:b/>
+                <w:sz w:val="22"/>
+              </w:rPr>
+              <w:t>مرحله</w:t>
+            </w:r>
+          </w:p>
+        </w:tc>
+        <w:tc>
+          <w:tcPr>
+            <w:tcW w:type="dxa" w:w="3324"/>
+            <w:shd w:fill="DBEAFE" w:val="clear"/>
+          </w:tcPr>
+          <w:p>
+            <w:pPr>
+              <w:bidi w:val="1"/>
+              <w:spacing w:after="160" w:line="360" w:lineRule="auto"/>
+              <w:jc w:val="right"/>
+            </w:pPr>
+            <w:r/>
+            <w:r>
+              <w:rPr>
+                <w:rFonts w:ascii="B Nazanin" w:hAnsi="B Nazanin" w:cs="B Nazanin" w:eastAsia="B Nazanin"/>
+                <w:b/>
+                <w:sz w:val="22"/>
+              </w:rPr>
+              <w:t>کار</w:t>
+            </w:r>
+          </w:p>
+        </w:tc>
+        <w:tc>
+          <w:tcPr>
+            <w:tcW w:type="dxa" w:w="3324"/>
+            <w:shd w:fill="DBEAFE" w:val="clear"/>
+          </w:tcPr>
+          <w:p>
+            <w:pPr>
+              <w:bidi w:val="1"/>
+              <w:spacing w:after="160" w:line="360" w:lineRule="auto"/>
+              <w:jc w:val="right"/>
+            </w:pPr>
+            <w:r/>
+            <w:r>
+              <w:rPr>
+                <w:rFonts w:ascii="B Nazanin" w:hAnsi="B Nazanin" w:cs="B Nazanin" w:eastAsia="B Nazanin"/>
+                <w:b/>
+                <w:sz w:val="22"/>
+              </w:rPr>
+              <w:t>API</w:t>
+            </w:r>
+          </w:p>
+        </w:tc>
+      </w:tr>
+      <w:tr>
+        <w:tc>
+          <w:tcPr>
+            <w:tcW w:type="dxa" w:w="3324"/>
+          </w:tcPr>
+          <w:p>
+            <w:pPr>
+              <w:bidi w:val="1"/>
+              <w:spacing w:after="160" w:line="360" w:lineRule="auto"/>
+              <w:jc w:val="right"/>
+            </w:pPr>
+            <w:r/>
+            <w:r>
+              <w:rPr>
+                <w:rFonts w:ascii="B Nazanin" w:hAnsi="B Nazanin" w:cs="B Nazanin" w:eastAsia="B Nazanin"/>
+                <w:b w:val="0"/>
+                <w:sz w:val="20"/>
+              </w:rPr>
+              <w:t>phone</w:t>
+            </w:r>
+          </w:p>
+        </w:tc>
+        <w:tc>
+          <w:tcPr>
+            <w:tcW w:type="dxa" w:w="3324"/>
+          </w:tcPr>
+          <w:p>
+            <w:pPr>
+              <w:bidi w:val="1"/>
+              <w:spacing w:after="160" w:line="360" w:lineRule="auto"/>
+              <w:jc w:val="right"/>
+            </w:pPr>
+            <w:r/>
+            <w:r>
+              <w:rPr>
+                <w:rFonts w:ascii="B Nazanin" w:hAnsi="B Nazanin" w:cs="B Nazanin" w:eastAsia="B Nazanin"/>
+                <w:b w:val="0"/>
+                <w:sz w:val="20"/>
+              </w:rPr>
+              <w:t>موبایل 09…</w:t>
+            </w:r>
+          </w:p>
+        </w:tc>
+        <w:tc>
+          <w:tcPr>
+            <w:tcW w:type="dxa" w:w="3324"/>
+          </w:tcPr>
+          <w:p>
+            <w:pPr>
+              <w:bidi w:val="1"/>
+              <w:spacing w:after="160" w:line="360" w:lineRule="auto"/>
+              <w:jc w:val="right"/>
+            </w:pPr>
+            <w:r/>
+            <w:r>
+              <w:rPr>
+                <w:rFonts w:ascii="B Nazanin" w:hAnsi="B Nazanin" w:cs="B Nazanin" w:eastAsia="B Nazanin"/>
+                <w:b w:val="0"/>
+                <w:sz w:val="20"/>
+              </w:rPr>
+              <w:t>BookingOtpRequest</w:t>
+            </w:r>
+          </w:p>
+        </w:tc>
+      </w:tr>
+      <w:tr>
+        <w:tc>
+          <w:tcPr>
+            <w:tcW w:type="dxa" w:w="3324"/>
+          </w:tcPr>
+          <w:p>
+            <w:pPr>
+              <w:bidi w:val="1"/>
+              <w:spacing w:after="160" w:line="360" w:lineRule="auto"/>
+              <w:jc w:val="right"/>
+            </w:pPr>
+            <w:r/>
+            <w:r>
+              <w:rPr>
+                <w:rFonts w:ascii="B Nazanin" w:hAnsi="B Nazanin" w:cs="B Nazanin" w:eastAsia="B Nazanin"/>
+                <w:b w:val="0"/>
+                <w:sz w:val="20"/>
+              </w:rPr>
+              <w:t>otp</w:t>
+            </w:r>
+          </w:p>
+        </w:tc>
+        <w:tc>
+          <w:tcPr>
+            <w:tcW w:type="dxa" w:w="3324"/>
+          </w:tcPr>
+          <w:p>
+            <w:pPr>
+              <w:bidi w:val="1"/>
+              <w:spacing w:after="160" w:line="360" w:lineRule="auto"/>
+              <w:jc w:val="right"/>
+            </w:pPr>
+            <w:r/>
+            <w:r>
+              <w:rPr>
+                <w:rFonts w:ascii="B Nazanin" w:hAnsi="B Nazanin" w:cs="B Nazanin" w:eastAsia="B Nazanin"/>
+                <w:b w:val="0"/>
+                <w:sz w:val="20"/>
+              </w:rPr>
+              <w:t>کد پیامک</w:t>
+            </w:r>
+          </w:p>
+        </w:tc>
+        <w:tc>
+          <w:tcPr>
+            <w:tcW w:type="dxa" w:w="3324"/>
+          </w:tcPr>
+          <w:p>
+            <w:pPr>
+              <w:bidi w:val="1"/>
+              <w:spacing w:after="160" w:line="360" w:lineRule="auto"/>
+              <w:jc w:val="right"/>
+            </w:pPr>
+            <w:r/>
+            <w:r>
+              <w:rPr>
+                <w:rFonts w:ascii="B Nazanin" w:hAnsi="B Nazanin" w:cs="B Nazanin" w:eastAsia="B Nazanin"/>
+                <w:b w:val="0"/>
+                <w:sz w:val="20"/>
+              </w:rPr>
+              <w:t>BookingOtpVerify → JWT + بیمار</w:t>
+            </w:r>
+          </w:p>
+        </w:tc>
+      </w:tr>
+      <w:tr>
+        <w:tc>
+          <w:tcPr>
+            <w:tcW w:type="dxa" w:w="3324"/>
+          </w:tcPr>
+          <w:p>
+            <w:pPr>
+              <w:bidi w:val="1"/>
+              <w:spacing w:after="160" w:line="360" w:lineRule="auto"/>
+              <w:jc w:val="right"/>
+            </w:pPr>
+            <w:r/>
+            <w:r>
+              <w:rPr>
+                <w:rFonts w:ascii="B Nazanin" w:hAnsi="B Nazanin" w:cs="B Nazanin" w:eastAsia="B Nazanin"/>
+                <w:b w:val="0"/>
+                <w:sz w:val="20"/>
+              </w:rPr>
+              <w:t>confirm</w:t>
+            </w:r>
+          </w:p>
+        </w:tc>
+        <w:tc>
+          <w:tcPr>
+            <w:tcW w:type="dxa" w:w="3324"/>
+          </w:tcPr>
+          <w:p>
+            <w:pPr>
+              <w:bidi w:val="1"/>
+              <w:spacing w:after="160" w:line="360" w:lineRule="auto"/>
+              <w:jc w:val="right"/>
+            </w:pPr>
+            <w:r/>
+            <w:r>
+              <w:rPr>
+                <w:rFonts w:ascii="B Nazanin" w:hAnsi="B Nazanin" w:cs="B Nazanin" w:eastAsia="B Nazanin"/>
+                <w:b w:val="0"/>
+                <w:sz w:val="20"/>
+              </w:rPr>
+              <w:t>بیمار کامل → تأیید</w:t>
+            </w:r>
+          </w:p>
+        </w:tc>
+        <w:tc>
+          <w:tcPr>
+            <w:tcW w:type="dxa" w:w="3324"/>
+          </w:tcPr>
+          <w:p>
+            <w:pPr>
+              <w:bidi w:val="1"/>
+              <w:spacing w:after="160" w:line="360" w:lineRule="auto"/>
+              <w:jc w:val="right"/>
+            </w:pPr>
+            <w:r/>
+            <w:r>
+              <w:rPr>
+                <w:rFonts w:ascii="B Nazanin" w:hAnsi="B Nazanin" w:cs="B Nazanin" w:eastAsia="B Nazanin"/>
+                <w:b w:val="0"/>
+                <w:sz w:val="20"/>
+              </w:rPr>
+              <w:t>ادامه رزرو</w:t>
+            </w:r>
+          </w:p>
+        </w:tc>
+      </w:tr>
+      <w:tr>
+        <w:tc>
+          <w:tcPr>
+            <w:tcW w:type="dxa" w:w="3324"/>
+          </w:tcPr>
+          <w:p>
+            <w:pPr>
+              <w:bidi w:val="1"/>
+              <w:spacing w:after="160" w:line="360" w:lineRule="auto"/>
+              <w:jc w:val="right"/>
+            </w:pPr>
+            <w:r/>
+            <w:r>
+              <w:rPr>
+                <w:rFonts w:ascii="B Nazanin" w:hAnsi="B Nazanin" w:cs="B Nazanin" w:eastAsia="B Nazanin"/>
+                <w:b w:val="0"/>
+                <w:sz w:val="20"/>
+              </w:rPr>
+              <w:t>profile</w:t>
+            </w:r>
+          </w:p>
+        </w:tc>
+        <w:tc>
+          <w:tcPr>
+            <w:tcW w:type="dxa" w:w="3324"/>
+          </w:tcPr>
+          <w:p>
+            <w:pPr>
+              <w:bidi w:val="1"/>
+              <w:spacing w:after="160" w:line="360" w:lineRule="auto"/>
+              <w:jc w:val="right"/>
+            </w:pPr>
+            <w:r/>
+            <w:r>
+              <w:rPr>
+                <w:rFonts w:ascii="B Nazanin" w:hAnsi="B Nazanin" w:cs="B Nazanin" w:eastAsia="B Nazanin"/>
+                <w:b w:val="0"/>
+                <w:sz w:val="20"/>
+              </w:rPr>
+              <w:t>نام/نام‌خانوادگی/کدملی</w:t>
+            </w:r>
+          </w:p>
+        </w:tc>
+        <w:tc>
+          <w:tcPr>
+            <w:tcW w:type="dxa" w:w="3324"/>
+          </w:tcPr>
+          <w:p>
+            <w:pPr>
+              <w:bidi w:val="1"/>
+              <w:spacing w:after="160" w:line="360" w:lineRule="auto"/>
+              <w:jc w:val="right"/>
+            </w:pPr>
+            <w:r/>
+            <w:r>
+              <w:rPr>
+                <w:rFonts w:ascii="B Nazanin" w:hAnsi="B Nazanin" w:cs="B Nazanin" w:eastAsia="B Nazanin"/>
+                <w:b w:val="0"/>
+                <w:sz w:val="20"/>
+              </w:rPr>
+              <w:t>BookingCompleteProfile</w:t>
+            </w:r>
+          </w:p>
+        </w:tc>
+      </w:tr>
+    </w:tbl>
+    <w:p/>
+    <w:tbl>
+      <w:tblPr>
+        <w:tblStyle w:val="TableGrid"/>
+        <w:tblW w:type="auto" w:w="0"/>
+        <w:jc w:val="center"/>
+        <w:tblLook w:firstColumn="1" w:firstRow="1" w:lastColumn="0" w:lastRow="0" w:noHBand="0" w:noVBand="1" w:val="04A0"/>
+      </w:tblPr>
+      <w:tblGrid>
+        <w:gridCol w:w="4986"/>
+        <w:gridCol w:w="4986"/>
+      </w:tblGrid>
+      <w:tr>
+        <w:tc>
+          <w:tcPr>
+            <w:tcW w:type="dxa" w:w="4986"/>
+            <w:shd w:fill="DBEAFE" w:val="clear"/>
+          </w:tcPr>
+          <w:p>
+            <w:pPr>
+              <w:bidi w:val="1"/>
+              <w:spacing w:after="160" w:line="360" w:lineRule="auto"/>
+              <w:jc w:val="right"/>
+            </w:pPr>
+            <w:r/>
+            <w:r>
+              <w:rPr>
+                <w:rFonts w:ascii="B Nazanin" w:hAnsi="B Nazanin" w:cs="B Nazanin" w:eastAsia="B Nazanin"/>
+                <w:b/>
+                <w:sz w:val="22"/>
+              </w:rPr>
+              <w:t>مقدار</w:t>
+            </w:r>
+          </w:p>
+        </w:tc>
+        <w:tc>
+          <w:tcPr>
+            <w:tcW w:type="dxa" w:w="4986"/>
+            <w:shd w:fill="DBEAFE" w:val="clear"/>
+          </w:tcPr>
+          <w:p>
+            <w:pPr>
+              <w:bidi w:val="1"/>
+              <w:spacing w:after="160" w:line="360" w:lineRule="auto"/>
+              <w:jc w:val="right"/>
+            </w:pPr>
+            <w:r/>
+            <w:r>
+              <w:rPr>
+                <w:rFonts w:ascii="B Nazanin" w:hAnsi="B Nazanin" w:cs="B Nazanin" w:eastAsia="B Nazanin"/>
+                <w:b/>
+                <w:sz w:val="22"/>
+              </w:rPr>
+              <w:t>عدد</w:t>
+            </w:r>
+          </w:p>
+        </w:tc>
+      </w:tr>
+      <w:tr>
+        <w:tc>
+          <w:tcPr>
+            <w:tcW w:type="dxa" w:w="4986"/>
+          </w:tcPr>
+          <w:p>
+            <w:pPr>
+              <w:bidi w:val="1"/>
+              <w:spacing w:after="160" w:line="360" w:lineRule="auto"/>
+              <w:jc w:val="right"/>
+            </w:pPr>
+            <w:r/>
+            <w:r>
+              <w:rPr>
+                <w:rFonts w:ascii="B Nazanin" w:hAnsi="B Nazanin" w:cs="B Nazanin" w:eastAsia="B Nazanin"/>
+                <w:b w:val="0"/>
+                <w:sz w:val="20"/>
+              </w:rPr>
+              <w:t>TTL کد OTP</w:t>
+            </w:r>
+          </w:p>
+        </w:tc>
+        <w:tc>
+          <w:tcPr>
+            <w:tcW w:type="dxa" w:w="4986"/>
+          </w:tcPr>
+          <w:p>
+            <w:pPr>
+              <w:bidi w:val="1"/>
+              <w:spacing w:after="160" w:line="360" w:lineRule="auto"/>
+              <w:jc w:val="right"/>
+            </w:pPr>
+            <w:r/>
+            <w:r>
+              <w:rPr>
+                <w:rFonts w:ascii="B Nazanin" w:hAnsi="B Nazanin" w:cs="B Nazanin" w:eastAsia="B Nazanin"/>
+                <w:b w:val="0"/>
+                <w:sz w:val="20"/>
+              </w:rPr>
+              <w:t>۵ دقیقه</w:t>
+            </w:r>
+          </w:p>
+        </w:tc>
+      </w:tr>
+      <w:tr>
+        <w:tc>
+          <w:tcPr>
+            <w:tcW w:type="dxa" w:w="4986"/>
+          </w:tcPr>
+          <w:p>
+            <w:pPr>
+              <w:bidi w:val="1"/>
+              <w:spacing w:after="160" w:line="360" w:lineRule="auto"/>
+              <w:jc w:val="right"/>
+            </w:pPr>
+            <w:r/>
+            <w:r>
+              <w:rPr>
+                <w:rFonts w:ascii="B Nazanin" w:hAnsi="B Nazanin" w:cs="B Nazanin" w:eastAsia="B Nazanin"/>
+                <w:b w:val="0"/>
+                <w:sz w:val="20"/>
+              </w:rPr>
+              <w:t>Cooldown ارسال مجدد</w:t>
+            </w:r>
+          </w:p>
+        </w:tc>
+        <w:tc>
+          <w:tcPr>
+            <w:tcW w:type="dxa" w:w="4986"/>
+          </w:tcPr>
+          <w:p>
+            <w:pPr>
+              <w:bidi w:val="1"/>
+              <w:spacing w:after="160" w:line="360" w:lineRule="auto"/>
+              <w:jc w:val="right"/>
+            </w:pPr>
+            <w:r/>
+            <w:r>
+              <w:rPr>
+                <w:rFonts w:ascii="B Nazanin" w:hAnsi="B Nazanin" w:cs="B Nazanin" w:eastAsia="B Nazanin"/>
+                <w:b w:val="0"/>
+                <w:sz w:val="20"/>
+              </w:rPr>
+              <w:t>۶۰ ثانیه</w:t>
+            </w:r>
+          </w:p>
+        </w:tc>
+      </w:tr>
+      <w:tr>
+        <w:tc>
+          <w:tcPr>
+            <w:tcW w:type="dxa" w:w="4986"/>
+          </w:tcPr>
+          <w:p>
+            <w:pPr>
+              <w:bidi w:val="1"/>
+              <w:spacing w:after="160" w:line="360" w:lineRule="auto"/>
+              <w:jc w:val="right"/>
+            </w:pPr>
+            <w:r/>
+            <w:r>
+              <w:rPr>
+                <w:rFonts w:ascii="B Nazanin" w:hAnsi="B Nazanin" w:cs="B Nazanin" w:eastAsia="B Nazanin"/>
+                <w:b w:val="0"/>
+                <w:sz w:val="20"/>
+              </w:rPr>
+              <w:t>Session بعد از verify</w:t>
+            </w:r>
+          </w:p>
+        </w:tc>
+        <w:tc>
+          <w:tcPr>
+            <w:tcW w:type="dxa" w:w="4986"/>
+          </w:tcPr>
+          <w:p>
+            <w:pPr>
+              <w:bidi w:val="1"/>
+              <w:spacing w:after="160" w:line="360" w:lineRule="auto"/>
+              <w:jc w:val="right"/>
+            </w:pPr>
+            <w:r/>
+            <w:r>
+              <w:rPr>
+                <w:rFonts w:ascii="B Nazanin" w:hAnsi="B Nazanin" w:cs="B Nazanin" w:eastAsia="B Nazanin"/>
+                <w:b w:val="0"/>
+                <w:sz w:val="20"/>
+              </w:rPr>
+              <w:t>۳۰ دقیقه</w:t>
+            </w:r>
+          </w:p>
+        </w:tc>
+      </w:tr>
+    </w:tbl>
+    <w:p/>
+    <w:p>
+      <w:pPr>
+        <w:bidi w:val="1"/>
+        <w:spacing w:after="160" w:line="360" w:lineRule="auto"/>
+        <w:jc w:val="right"/>
+      </w:pPr>
+      <w:r>
+        <w:rPr>
+          <w:rFonts w:ascii="B Nazanin" w:hAnsi="B Nazanin" w:cs="B Nazanin" w:eastAsia="B Nazanin"/>
+          <w:b w:val="0"/>
+          <w:sz w:val="24"/>
+        </w:rPr>
+        <w:t>اگر SMS شکست بخورد: حذف OTP + ClearCooldownAsync تا کاربر دوباره بتواند درخواست بدهد.</w:t>
+      </w:r>
+    </w:p>
+    <w:p>
+      <w:pPr>
+        <w:bidi w:val="1"/>
+        <w:spacing w:after="160" w:line="360" w:lineRule="auto"/>
+        <w:jc w:val="right"/>
+      </w:pPr>
+      <w:r>
+        <w:rPr>
+          <w:rFonts w:ascii="B Nazanin" w:hAnsi="B Nazanin" w:cs="B Nazanin" w:eastAsia="B Nazanin"/>
+          <w:b w:val="0"/>
+          <w:sz w:val="22"/>
+        </w:rPr>
+        <w:t>تفاوت با OTP سقف RAG (فصل ۱۰): توکن portal_rag_access_token فقط برای Ask است؛ JWT رزرو برای Create/Cancel است.</w:t>
+      </w:r>
+    </w:p>
+    <w:p>
+      <w:pPr>
+        <w:pStyle w:val="Heading1"/>
+        <w:bidi w:val="1"/>
+        <w:spacing w:after="160" w:line="360" w:lineRule="auto"/>
+        <w:jc w:val="right"/>
+      </w:pPr>
+      <w:r>
+        <w:rPr>
+          <w:rFonts w:ascii="B Nazanin" w:hAnsi="B Nazanin" w:cs="B Nazanin" w:eastAsia="B Nazanin"/>
+          <w:b/>
+          <w:color w:val="1F4E79"/>
+          <w:sz w:val="36"/>
+        </w:rPr>
+        <w:t>فصل ۱۶ — ذخیره OTP رزرو و عیب‌یابی</w:t>
+      </w:r>
+    </w:p>
+    <w:p>
+      <w:pPr>
+        <w:bidi w:val="1"/>
+        <w:spacing w:after="160" w:line="360" w:lineRule="auto"/>
+        <w:jc w:val="right"/>
+      </w:pPr>
+      <w:r>
+        <w:rPr>
+          <w:rFonts w:ascii="B Nazanin" w:hAnsi="B Nazanin" w:cs="B Nazanin" w:eastAsia="B Nazanin"/>
+          <w:b w:val="0"/>
+          <w:sz w:val="24"/>
+        </w:rPr>
+        <w:t>قرارداد: IBookingOtpStore · حافظه: MemoryBookingOtpStore · SQL: DbBookingOtpStore روی جدول BookingAuthTokens</w:t>
+      </w:r>
+    </w:p>
+    <w:p>
+      <w:pPr>
+        <w:bidi w:val="0"/>
+        <w:spacing w:before="80" w:after="200"/>
+        <w:jc w:val="left"/>
+        <w:shd w:fill="F1F5F9" w:val="clear"/>
+      </w:pPr>
+      <w:r>
+        <w:rPr>
+          <w:rFonts w:ascii="Consolas" w:hAnsi="Consolas" w:cs="Consolas" w:eastAsia="Consolas"/>
+          <w:b w:val="0"/>
+          <w:sz w:val="18"/>
+        </w:rPr>
+        <w:t>SetAsync / TryGetAsync / RemoveAsync</w:t>
+        <w:br/>
+        <w:t>SetCooldownAsync / IsInCooldownAsync / ClearCooldownAsync</w:t>
+        <w:br/>
+        <w:t>SetSessionAsync / GetSessionPhoneAsync</w:t>
+      </w:r>
+    </w:p>
+    <w:p>
+      <w:pPr>
+        <w:pStyle w:val="ListBullet"/>
+        <w:bidi w:val="1"/>
+        <w:spacing w:after="160" w:line="360" w:lineRule="auto"/>
+        <w:jc w:val="right"/>
+      </w:pPr>
+      <w:r>
+        <w:rPr>
+          <w:rFonts w:ascii="B Nazanin" w:hAnsi="B Nazanin" w:cs="B Nazanin" w:eastAsia="B Nazanin"/>
+          <w:b w:val="0"/>
+          <w:sz w:val="24"/>
+        </w:rPr>
+        <w:t>DbBookingOtpStore: اگر SQL/جدول در دسترس نباشد → fallback حافظه</w:t>
+      </w:r>
+    </w:p>
+    <w:p>
+      <w:pPr>
+        <w:pStyle w:val="ListBullet"/>
+        <w:bidi w:val="1"/>
+        <w:spacing w:after="160" w:line="360" w:lineRule="auto"/>
+        <w:jc w:val="right"/>
+      </w:pPr>
+      <w:r>
+        <w:rPr>
+          <w:rFonts w:ascii="B Nazanin" w:hAnsi="B Nazanin" w:cs="B Nazanin" w:eastAsia="B Nazanin"/>
+          <w:b w:val="0"/>
+          <w:sz w:val="24"/>
+        </w:rPr>
+        <w:t>Get: اول SQL، بعد memory (برای writeهایی که قبلاً fallback شده‌اند)</w:t>
+      </w:r>
+    </w:p>
+    <w:p>
+      <w:pPr>
+        <w:pStyle w:val="ListBullet"/>
+        <w:bidi w:val="1"/>
+        <w:spacing w:after="160" w:line="360" w:lineRule="auto"/>
+        <w:jc w:val="right"/>
+      </w:pPr>
+      <w:r>
+        <w:rPr>
+          <w:rFonts w:ascii="B Nazanin" w:hAnsi="B Nazanin" w:cs="B Nazanin" w:eastAsia="B Nazanin"/>
+          <w:b w:val="0"/>
+          <w:sz w:val="24"/>
+        </w:rPr>
+        <w:t>RedisBookingOtpStore هم الگوی مشابه دارد؛ DI فعال معمولاً DB است</w:t>
+      </w:r>
+    </w:p>
+    <w:tbl>
+      <w:tblPr>
+        <w:tblStyle w:val="TableGrid"/>
+        <w:tblW w:type="auto" w:w="0"/>
+        <w:jc w:val="center"/>
+        <w:tblLook w:firstColumn="1" w:firstRow="1" w:lastColumn="0" w:lastRow="0" w:noHBand="0" w:noVBand="1" w:val="04A0"/>
+      </w:tblPr>
+      <w:tblGrid>
+        <w:gridCol w:w="4986"/>
+        <w:gridCol w:w="4986"/>
+      </w:tblGrid>
+      <w:tr>
+        <w:tc>
+          <w:tcPr>
+            <w:tcW w:type="dxa" w:w="4986"/>
+            <w:shd w:fill="DBEAFE" w:val="clear"/>
+          </w:tcPr>
+          <w:p>
+            <w:pPr>
+              <w:bidi w:val="1"/>
+              <w:spacing w:after="160" w:line="360" w:lineRule="auto"/>
+              <w:jc w:val="right"/>
+            </w:pPr>
+            <w:r/>
+            <w:r>
+              <w:rPr>
+                <w:rFonts w:ascii="B Nazanin" w:hAnsi="B Nazanin" w:cs="B Nazanin" w:eastAsia="B Nazanin"/>
+                <w:b/>
+                <w:sz w:val="22"/>
+              </w:rPr>
+              <w:t>علامت</w:t>
+            </w:r>
+          </w:p>
+        </w:tc>
+        <w:tc>
+          <w:tcPr>
+            <w:tcW w:type="dxa" w:w="4986"/>
+            <w:shd w:fill="DBEAFE" w:val="clear"/>
+          </w:tcPr>
+          <w:p>
+            <w:pPr>
+              <w:bidi w:val="1"/>
+              <w:spacing w:after="160" w:line="360" w:lineRule="auto"/>
+              <w:jc w:val="right"/>
+            </w:pPr>
+            <w:r/>
+            <w:r>
+              <w:rPr>
+                <w:rFonts w:ascii="B Nazanin" w:hAnsi="B Nazanin" w:cs="B Nazanin" w:eastAsia="B Nazanin"/>
+                <w:b/>
+                <w:sz w:val="22"/>
+              </w:rPr>
+              <w:t>اقدام</w:t>
+            </w:r>
+          </w:p>
+        </w:tc>
+      </w:tr>
+      <w:tr>
+        <w:tc>
+          <w:tcPr>
+            <w:tcW w:type="dxa" w:w="4986"/>
+          </w:tcPr>
+          <w:p>
+            <w:pPr>
+              <w:bidi w:val="1"/>
+              <w:spacing w:after="160" w:line="360" w:lineRule="auto"/>
+              <w:jc w:val="right"/>
+            </w:pPr>
+            <w:r/>
+            <w:r>
+              <w:rPr>
+                <w:rFonts w:ascii="B Nazanin" w:hAnsi="B Nazanin" w:cs="B Nazanin" w:eastAsia="B Nazanin"/>
+                <w:b w:val="0"/>
+                <w:sz w:val="20"/>
+              </w:rPr>
+              <w:t>ارسال کد ناموفق + cooldown گیر</w:t>
+            </w:r>
+          </w:p>
+        </w:tc>
+        <w:tc>
+          <w:tcPr>
+            <w:tcW w:type="dxa" w:w="4986"/>
+          </w:tcPr>
+          <w:p>
+            <w:pPr>
+              <w:bidi w:val="1"/>
+              <w:spacing w:after="160" w:line="360" w:lineRule="auto"/>
+              <w:jc w:val="right"/>
+            </w:pPr>
+            <w:r/>
+            <w:r>
+              <w:rPr>
+                <w:rFonts w:ascii="B Nazanin" w:hAnsi="B Nazanin" w:cs="B Nazanin" w:eastAsia="B Nazanin"/>
+                <w:b w:val="0"/>
+                <w:sz w:val="20"/>
+              </w:rPr>
+              <w:t>recreate healan-webapi (ClearCooldown)</w:t>
+            </w:r>
+          </w:p>
+        </w:tc>
+      </w:tr>
+      <w:tr>
+        <w:tc>
+          <w:tcPr>
+            <w:tcW w:type="dxa" w:w="4986"/>
+          </w:tcPr>
+          <w:p>
+            <w:pPr>
+              <w:bidi w:val="1"/>
+              <w:spacing w:after="160" w:line="360" w:lineRule="auto"/>
+              <w:jc w:val="right"/>
+            </w:pPr>
+            <w:r/>
+            <w:r>
+              <w:rPr>
+                <w:rFonts w:ascii="B Nazanin" w:hAnsi="B Nazanin" w:cs="B Nazanin" w:eastAsia="B Nazanin"/>
+                <w:b w:val="0"/>
+                <w:sz w:val="20"/>
+              </w:rPr>
+              <w:t>502 روی BookingOtpRequest</w:t>
+            </w:r>
+          </w:p>
+        </w:tc>
+        <w:tc>
+          <w:tcPr>
+            <w:tcW w:type="dxa" w:w="4986"/>
+          </w:tcPr>
+          <w:p>
+            <w:pPr>
+              <w:bidi w:val="1"/>
+              <w:spacing w:after="160" w:line="360" w:lineRule="auto"/>
+              <w:jc w:val="right"/>
+            </w:pPr>
+            <w:r/>
+            <w:r>
+              <w:rPr>
+                <w:rFonts w:ascii="B Nazanin" w:hAnsi="B Nazanin" w:cs="B Nazanin" w:eastAsia="B Nazanin"/>
+                <w:b w:val="0"/>
+                <w:sz w:val="20"/>
+              </w:rPr>
+              <w:t>apply-server-appsettings + recreate API</w:t>
+            </w:r>
+          </w:p>
+        </w:tc>
+      </w:tr>
+      <w:tr>
+        <w:tc>
+          <w:tcPr>
+            <w:tcW w:type="dxa" w:w="4986"/>
+          </w:tcPr>
+          <w:p>
+            <w:pPr>
+              <w:bidi w:val="1"/>
+              <w:spacing w:after="160" w:line="360" w:lineRule="auto"/>
+              <w:jc w:val="right"/>
+            </w:pPr>
+            <w:r/>
+            <w:r>
+              <w:rPr>
+                <w:rFonts w:ascii="B Nazanin" w:hAnsi="B Nazanin" w:cs="B Nazanin" w:eastAsia="B Nazanin"/>
+                <w:b w:val="0"/>
+                <w:sz w:val="20"/>
+              </w:rPr>
+              <w:t>Verify بین instance کد را نمی‌بیند</w:t>
+            </w:r>
+          </w:p>
+        </w:tc>
+        <w:tc>
+          <w:tcPr>
+            <w:tcW w:type="dxa" w:w="4986"/>
+          </w:tcPr>
+          <w:p>
+            <w:pPr>
+              <w:bidi w:val="1"/>
+              <w:spacing w:after="160" w:line="360" w:lineRule="auto"/>
+              <w:jc w:val="right"/>
+            </w:pPr>
+            <w:r/>
+            <w:r>
+              <w:rPr>
+                <w:rFonts w:ascii="B Nazanin" w:hAnsi="B Nazanin" w:cs="B Nazanin" w:eastAsia="B Nazanin"/>
+                <w:b w:val="0"/>
+                <w:sz w:val="20"/>
+              </w:rPr>
+              <w:t>migrate جدول BookingAuthTokens</w:t>
+            </w:r>
+          </w:p>
+        </w:tc>
+      </w:tr>
+      <w:tr>
+        <w:tc>
+          <w:tcPr>
+            <w:tcW w:type="dxa" w:w="4986"/>
+          </w:tcPr>
+          <w:p>
+            <w:pPr>
+              <w:bidi w:val="1"/>
+              <w:spacing w:after="160" w:line="360" w:lineRule="auto"/>
+              <w:jc w:val="right"/>
+            </w:pPr>
+            <w:r/>
+            <w:r>
+              <w:rPr>
+                <w:rFonts w:ascii="B Nazanin" w:hAnsi="B Nazanin" w:cs="B Nazanin" w:eastAsia="B Nazanin"/>
+                <w:b w:val="0"/>
+                <w:sz w:val="20"/>
+              </w:rPr>
+              <w:t>تاریخ شمسی کار نمی‌کند</w:t>
+            </w:r>
+          </w:p>
+        </w:tc>
+        <w:tc>
+          <w:tcPr>
+            <w:tcW w:type="dxa" w:w="4986"/>
+          </w:tcPr>
+          <w:p>
+            <w:pPr>
+              <w:bidi w:val="1"/>
+              <w:spacing w:after="160" w:line="360" w:lineRule="auto"/>
+              <w:jc w:val="right"/>
+            </w:pPr>
+            <w:r/>
+            <w:r>
+              <w:rPr>
+                <w:rFonts w:ascii="B Nazanin" w:hAnsi="B Nazanin" w:cs="B Nazanin" w:eastAsia="B Nazanin"/>
+                <w:b w:val="0"/>
+                <w:sz w:val="20"/>
+              </w:rPr>
+              <w:t>--no-cache healan-portal + nginx؛ مارکر build-v13</w:t>
+            </w:r>
+          </w:p>
+        </w:tc>
+      </w:tr>
+    </w:tbl>
+    <w:p/>
     <w:p>
       <w:pPr>
         <w:pStyle w:val="Heading1"/>
@@ -9346,6 +12129,22 @@
           <w:sz w:val="24"/>
         </w:rPr>
         <w:t>Ask = Embedding + cosine + metadata.answer</w:t>
+      </w:r>
+    </w:p>
+    <w:p>
+      <w:pPr>
+        <w:pStyle w:val="ListBullet"/>
+        <w:bidi w:val="1"/>
+        <w:spacing w:after="160" w:line="360" w:lineRule="auto"/>
+        <w:jc w:val="right"/>
+      </w:pPr>
+      <w:r>
+        <w:rPr>
+          <w:rFonts w:ascii="B Nazanin" w:hAnsi="B Nazanin" w:cs="B Nazanin" w:eastAsia="B Nazanin"/>
+          <w:b w:val="0"/>
+          <w:sz w:val="24"/>
+        </w:rPr>
+        <w:t>رزرو نوبت جدا: intent فارسی + شمسی/نسبی + OTP موبایل (DB/Memory)</w:t>
       </w:r>
     </w:p>
     <w:sectPr>

</xml_diff>